<commit_message>
Add automatic interest accrual: balances grow on their own via TODAY()
- Interest sheet: new columns Interest Start (earliest deposit), Periods Elapsed
  (days/months to TODAY), Interest to Date, and Balance Today (compounds live)
- Balance sheet: adds Interest to Date + Balance Today columns
- Dashboard: Total Balance Today, Interest Earned to Date, pie & goal use Balance Today
- Removed manual Interest seed transaction (auto-accrual replaces it to avoid double-count)
- Updated formula reference .docx accordingly
</commit_message>
<xml_diff>
--- a/Digital-Bank-Savings-Tracker-Formulas.docx
+++ b/Digital-Bank-Savings-Tracker-Formulas.docx
@@ -172,21 +172,21 @@
                 <w:color w:val="1F3864"/>
                 <w:sz w:val="18"/>
               </w:rPr>
-              <w:t xml:space="preserve">=SUM(Balance!$F$6:$F$19)</w:t>
-            </w:r>
-          </w:p>
-        </w:tc>
-        <w:tc>
-          <w:tcPr>
-            <w:tcW w:w="3800" w:type="dxa"/>
-            <w:vAlign w:val="center"/>
-          </w:tcPr>
-          <w:p>
-            <w:r>
-              <w:rPr>
-                <w:sz w:val="18"/>
-              </w:rPr>
-              <w:t xml:space="preserve">Total Balance (All Accounts): adds the Current Balance of all 14 accounts.</w:t>
+              <w:t xml:space="preserve">=SUM(Balance!$H$6:$H$19)</w:t>
+            </w:r>
+          </w:p>
+        </w:tc>
+        <w:tc>
+          <w:tcPr>
+            <w:tcW w:w="3800" w:type="dxa"/>
+            <w:vAlign w:val="center"/>
+          </w:tcPr>
+          <w:p>
+            <w:r>
+              <w:rPr>
+                <w:sz w:val="18"/>
+              </w:rPr>
+              <w:t xml:space="preserve">Total Balance Today (incl. interest): adds every account's Balance Today. Grows on its own as time passes.</w:t>
             </w:r>
           </w:p>
         </w:tc>
@@ -266,21 +266,21 @@
                 <w:color w:val="1F3864"/>
                 <w:sz w:val="18"/>
               </w:rPr>
-              <w:t xml:space="preserve">=SUMIFS(Transactions!$E$6:$E$205,Transactions!$B$6:$B$205,"Interest")</w:t>
-            </w:r>
-          </w:p>
-        </w:tc>
-        <w:tc>
-          <w:tcPr>
-            <w:tcW w:w="3800" w:type="dxa"/>
-            <w:vAlign w:val="center"/>
-          </w:tcPr>
-          <w:p>
-            <w:r>
-              <w:rPr>
-                <w:sz w:val="18"/>
-              </w:rPr>
-              <w:t xml:space="preserve">Total Interest Credited: adds the Amount of every transaction whose Type is "Interest".</w:t>
+              <w:t xml:space="preserve">=SUM(Balance!$G$6:$G$19)</w:t>
+            </w:r>
+          </w:p>
+        </w:tc>
+        <w:tc>
+          <w:tcPr>
+            <w:tcW w:w="3800" w:type="dxa"/>
+            <w:vAlign w:val="center"/>
+          </w:tcPr>
+          <w:p>
+            <w:r>
+              <w:rPr>
+                <w:sz w:val="18"/>
+              </w:rPr>
+              <w:t xml:space="preserve">Interest Earned to Date (auto): total interest accrued so far across all accounts; increases each day/month.</w:t>
             </w:r>
           </w:p>
         </w:tc>
@@ -488,21 +488,21 @@
                 <w:color w:val="1F3864"/>
                 <w:sz w:val="18"/>
               </w:rPr>
-              <w:t xml:space="preserve">=IFERROR(VLOOKUP("Maya - Personal Goal",Balance!$C$6:$F$19,4,FALSE),0)</w:t>
-            </w:r>
-          </w:p>
-        </w:tc>
-        <w:tc>
-          <w:tcPr>
-            <w:tcW w:w="3800" w:type="dxa"/>
-            <w:vAlign w:val="center"/>
-          </w:tcPr>
-          <w:p>
-            <w:r>
-              <w:rPr>
-                <w:sz w:val="18"/>
-              </w:rPr>
-              <w:t xml:space="preserve">Maya Personal Goal current balance: looks up that account on the Balance sheet and returns its Current Balance.</w:t>
+              <w:t xml:space="preserve">=IFERROR(VLOOKUP("Maya - Personal Goal",Balance!$C$6:$H$19,6,FALSE),0)</w:t>
+            </w:r>
+          </w:p>
+        </w:tc>
+        <w:tc>
+          <w:tcPr>
+            <w:tcW w:w="3800" w:type="dxa"/>
+            <w:vAlign w:val="center"/>
+          </w:tcPr>
+          <w:p>
+            <w:r>
+              <w:rPr>
+                <w:sz w:val="18"/>
+              </w:rPr>
+              <w:t xml:space="preserve">Maya Personal Goal Balance Today: looks up that account and returns its Balance Today (principal + accrued interest).</w:t>
             </w:r>
           </w:p>
         </w:tc>
@@ -663,21 +663,21 @@
                 <w:color w:val="1F3864"/>
                 <w:sz w:val="18"/>
               </w:rPr>
-              <w:t xml:space="preserve">=SUMIF(Balance!$A$6:$A$19,A17,Balance!$F$6:$F$19)</w:t>
-            </w:r>
-          </w:p>
-        </w:tc>
-        <w:tc>
-          <w:tcPr>
-            <w:tcW w:w="3800" w:type="dxa"/>
-            <w:vAlign w:val="center"/>
-          </w:tcPr>
-          <w:p>
-            <w:r>
-              <w:rPr>
-                <w:sz w:val="18"/>
-              </w:rPr>
-              <w:t xml:space="preserve">Totals the Current Balance of every account belonging to the bank named in column A (e.g. all Maya accounts).</w:t>
+              <w:t xml:space="preserve">=SUMIF(Balance!$A$6:$A$19,A17,Balance!$H$6:$H$19)</w:t>
+            </w:r>
+          </w:p>
+        </w:tc>
+        <w:tc>
+          <w:tcPr>
+            <w:tcW w:w="3800" w:type="dxa"/>
+            <w:vAlign w:val="center"/>
+          </w:tcPr>
+          <w:p>
+            <w:r>
+              <w:rPr>
+                <w:sz w:val="18"/>
+              </w:rPr>
+              <w:t xml:space="preserve">Totals the Balance Today of every account belonging to the bank named in column A (e.g. all Maya accounts).</w:t>
             </w:r>
           </w:p>
         </w:tc>
@@ -1274,7 +1274,7 @@
               <w:rPr>
                 <w:sz w:val="18"/>
               </w:rPr>
-              <w:t xml:space="preserve">Current Balance: Deposits plus Net Transactions.</w:t>
+              <w:t xml:space="preserve">Current Balance: Deposits plus Net Transactions (money you moved).</w:t>
             </w:r>
           </w:p>
         </w:tc>
@@ -1307,6 +1307,100 @@
                 <w:color w:val="1F3864"/>
                 <w:sz w:val="18"/>
               </w:rPr>
+              <w:t xml:space="preserve">=IFERROR(VLOOKUP(C6,Interest!$D$6:$Q$19,13,FALSE),0)</w:t>
+            </w:r>
+          </w:p>
+        </w:tc>
+        <w:tc>
+          <w:tcPr>
+            <w:tcW w:w="3800" w:type="dxa"/>
+            <w:vAlign w:val="center"/>
+          </w:tcPr>
+          <w:p>
+            <w:r>
+              <w:rPr>
+                <w:sz w:val="18"/>
+              </w:rPr>
+              <w:t xml:space="preserve">Interest to Date: the auto-accrued interest for this account (from the Interest sheet); grows with the date.</w:t>
+            </w:r>
+          </w:p>
+        </w:tc>
+      </w:tr>
+      <w:tr>
+        <w:tc>
+          <w:tcPr>
+            <w:tcW w:w="1500" w:type="dxa"/>
+            <w:vAlign w:val="center"/>
+          </w:tcPr>
+          <w:p>
+            <w:r>
+              <w:rPr>
+                <w:b/>
+                <w:sz w:val="18"/>
+              </w:rPr>
+              <w:t xml:space="preserve">H6:H19</w:t>
+            </w:r>
+          </w:p>
+        </w:tc>
+        <w:tc>
+          <w:tcPr>
+            <w:tcW w:w="4300" w:type="dxa"/>
+            <w:vAlign w:val="center"/>
+          </w:tcPr>
+          <w:p>
+            <w:r>
+              <w:rPr>
+                <w:rFonts w:ascii="Consolas" w:hAnsi="Consolas"/>
+                <w:color w:val="1F3864"/>
+                <w:sz w:val="18"/>
+              </w:rPr>
+              <w:t xml:space="preserve">=IFERROR(VLOOKUP(C6,Interest!$D$6:$Q$19,14,FALSE),0)</w:t>
+            </w:r>
+          </w:p>
+        </w:tc>
+        <w:tc>
+          <w:tcPr>
+            <w:tcW w:w="3800" w:type="dxa"/>
+            <w:vAlign w:val="center"/>
+          </w:tcPr>
+          <w:p>
+            <w:r>
+              <w:rPr>
+                <w:sz w:val="18"/>
+              </w:rPr>
+              <w:t xml:space="preserve">Balance Today: current balance plus interest accrued to date. This is the number that increases on its own.</w:t>
+            </w:r>
+          </w:p>
+        </w:tc>
+      </w:tr>
+      <w:tr>
+        <w:tc>
+          <w:tcPr>
+            <w:tcW w:w="1500" w:type="dxa"/>
+            <w:vAlign w:val="center"/>
+          </w:tcPr>
+          <w:p>
+            <w:r>
+              <w:rPr>
+                <w:b/>
+                <w:sz w:val="18"/>
+              </w:rPr>
+              <w:t xml:space="preserve">I6:I19</w:t>
+            </w:r>
+          </w:p>
+        </w:tc>
+        <w:tc>
+          <w:tcPr>
+            <w:tcW w:w="4300" w:type="dxa"/>
+            <w:vAlign w:val="center"/>
+          </w:tcPr>
+          <w:p>
+            <w:r>
+              <w:rPr>
+                <w:rFonts w:ascii="Consolas" w:hAnsi="Consolas"/>
+                <w:color w:val="1F3864"/>
+                <w:sz w:val="18"/>
+              </w:rPr>
               <w:t xml:space="preserve">=IFERROR(VLOOKUP(C6,Interest!$D$6:$L$19,9,FALSE),0)</w:t>
             </w:r>
           </w:p>
@@ -1321,71 +1415,71 @@
               <w:rPr>
                 <w:sz w:val="18"/>
               </w:rPr>
-              <w:t xml:space="preserve">Interest (1 Yr): pulls the projected 1-year interest for this account from the Interest sheet.</w:t>
-            </w:r>
-          </w:p>
-        </w:tc>
-      </w:tr>
-      <w:tr>
-        <w:tc>
-          <w:tcPr>
-            <w:tcW w:w="1500" w:type="dxa"/>
-            <w:vAlign w:val="center"/>
-          </w:tcPr>
-          <w:p>
-            <w:r>
-              <w:rPr>
-                <w:b/>
-                <w:sz w:val="18"/>
-              </w:rPr>
-              <w:t xml:space="preserve">H6:H19</w:t>
-            </w:r>
-          </w:p>
-        </w:tc>
-        <w:tc>
-          <w:tcPr>
-            <w:tcW w:w="4300" w:type="dxa"/>
-            <w:vAlign w:val="center"/>
-          </w:tcPr>
-          <w:p>
-            <w:r>
-              <w:rPr>
-                <w:rFonts w:ascii="Consolas" w:hAnsi="Consolas"/>
-                <w:color w:val="1F3864"/>
-                <w:sz w:val="18"/>
-              </w:rPr>
-              <w:t xml:space="preserve">=F6+G6</w:t>
-            </w:r>
-          </w:p>
-        </w:tc>
-        <w:tc>
-          <w:tcPr>
-            <w:tcW w:w="3800" w:type="dxa"/>
-            <w:vAlign w:val="center"/>
-          </w:tcPr>
-          <w:p>
-            <w:r>
-              <w:rPr>
-                <w:sz w:val="18"/>
-              </w:rPr>
-              <w:t xml:space="preserve">Projected Balance (1 Yr): current balance plus projected interest.</w:t>
-            </w:r>
-          </w:p>
-        </w:tc>
-      </w:tr>
-      <w:tr>
-        <w:tc>
-          <w:tcPr>
-            <w:tcW w:w="1500" w:type="dxa"/>
-            <w:vAlign w:val="center"/>
-          </w:tcPr>
-          <w:p>
-            <w:r>
-              <w:rPr>
-                <w:b/>
-                <w:sz w:val="18"/>
-              </w:rPr>
-              <w:t xml:space="preserve">D20:H20</w:t>
+              <w:t xml:space="preserve">Interest (1 Yr): projected 1-year interest for this account.</w:t>
+            </w:r>
+          </w:p>
+        </w:tc>
+      </w:tr>
+      <w:tr>
+        <w:tc>
+          <w:tcPr>
+            <w:tcW w:w="1500" w:type="dxa"/>
+            <w:vAlign w:val="center"/>
+          </w:tcPr>
+          <w:p>
+            <w:r>
+              <w:rPr>
+                <w:b/>
+                <w:sz w:val="18"/>
+              </w:rPr>
+              <w:t xml:space="preserve">J6:J19</w:t>
+            </w:r>
+          </w:p>
+        </w:tc>
+        <w:tc>
+          <w:tcPr>
+            <w:tcW w:w="4300" w:type="dxa"/>
+            <w:vAlign w:val="center"/>
+          </w:tcPr>
+          <w:p>
+            <w:r>
+              <w:rPr>
+                <w:rFonts w:ascii="Consolas" w:hAnsi="Consolas"/>
+                <w:color w:val="1F3864"/>
+                <w:sz w:val="18"/>
+              </w:rPr>
+              <w:t xml:space="preserve">=F6+I6</w:t>
+            </w:r>
+          </w:p>
+        </w:tc>
+        <w:tc>
+          <w:tcPr>
+            <w:tcW w:w="3800" w:type="dxa"/>
+            <w:vAlign w:val="center"/>
+          </w:tcPr>
+          <w:p>
+            <w:r>
+              <w:rPr>
+                <w:sz w:val="18"/>
+              </w:rPr>
+              <w:t xml:space="preserve">Projected Balance (1 Yr): current balance plus projected 1-year interest.</w:t>
+            </w:r>
+          </w:p>
+        </w:tc>
+      </w:tr>
+      <w:tr>
+        <w:tc>
+          <w:tcPr>
+            <w:tcW w:w="1500" w:type="dxa"/>
+            <w:vAlign w:val="center"/>
+          </w:tcPr>
+          <w:p>
+            <w:r>
+              <w:rPr>
+                <w:b/>
+                <w:sz w:val="18"/>
+              </w:rPr>
+              <w:t xml:space="preserve">D20:J20</w:t>
             </w:r>
           </w:p>
         </w:tc>
@@ -1415,7 +1509,7 @@
               <w:rPr>
                 <w:sz w:val="18"/>
               </w:rPr>
-              <w:t xml:space="preserve">Column totals row (same SUM pattern for E, F, G and H).</w:t>
+              <w:t xml:space="preserve">Column totals row (same SUM pattern for E, F, G, H, I and J).</w:t>
             </w:r>
           </w:p>
         </w:tc>
@@ -1437,7 +1531,7 @@
     </w:p>
     <w:p>
       <w:r>
-        <w:t xml:space="preserve">One row per account (rows 6-19). Daily accounts (Maya/UNO/Banko/CIMB/Maribank savings) compound daily; the rest compound monthly. Maya Savings rate is set to 10%. Example shows row 6.</w:t>
+        <w:t xml:space="preserve">One row per account (rows 6-19). Daily accounts (Maya/UNO/Banko/CIMB/Maribank savings) compound daily; the rest compound monthly. Maya Savings rate is set to 10%. Example shows row 6. Columns N-Q make the balance grow automatically over time using the TODAY() function.</w:t>
       </w:r>
     </w:p>
     <w:tbl>
@@ -1848,7 +1942,195 @@
                 <w:b/>
                 <w:sz w:val="18"/>
               </w:rPr>
-              <w:t xml:space="preserve">G20,I20,K20,L20</w:t>
+              <w:t xml:space="preserve">N6:N19</w:t>
+            </w:r>
+          </w:p>
+        </w:tc>
+        <w:tc>
+          <w:tcPr>
+            <w:tcW w:w="4300" w:type="dxa"/>
+            <w:vAlign w:val="center"/>
+          </w:tcPr>
+          <w:p>
+            <w:r>
+              <w:rPr>
+                <w:rFonts w:ascii="Consolas" w:hAnsi="Consolas"/>
+                <w:color w:val="1F3864"/>
+                <w:sz w:val="18"/>
+              </w:rPr>
+              <w:t xml:space="preserve">=IF(COUNTIFS(Deposit!$C$6:$C$205,D6)=0,"",MINIFS(Deposit!$A$6:$A$205,Deposit!$C$6:$C$205,D6))</w:t>
+            </w:r>
+          </w:p>
+        </w:tc>
+        <w:tc>
+          <w:tcPr>
+            <w:tcW w:w="3800" w:type="dxa"/>
+            <w:vAlign w:val="center"/>
+          </w:tcPr>
+          <w:p>
+            <w:r>
+              <w:rPr>
+                <w:sz w:val="18"/>
+              </w:rPr>
+              <w:t xml:space="preserve">Interest Start: the earliest deposit date for this account - interest accrues from this date.</w:t>
+            </w:r>
+          </w:p>
+        </w:tc>
+      </w:tr>
+      <w:tr>
+        <w:tc>
+          <w:tcPr>
+            <w:tcW w:w="1500" w:type="dxa"/>
+            <w:vAlign w:val="center"/>
+          </w:tcPr>
+          <w:p>
+            <w:r>
+              <w:rPr>
+                <w:b/>
+                <w:sz w:val="18"/>
+              </w:rPr>
+              <w:t xml:space="preserve">O6:O19</w:t>
+            </w:r>
+          </w:p>
+        </w:tc>
+        <w:tc>
+          <w:tcPr>
+            <w:tcW w:w="4300" w:type="dxa"/>
+            <w:vAlign w:val="center"/>
+          </w:tcPr>
+          <w:p>
+            <w:r>
+              <w:rPr>
+                <w:rFonts w:ascii="Consolas" w:hAnsi="Consolas"/>
+                <w:color w:val="1F3864"/>
+                <w:sz w:val="18"/>
+              </w:rPr>
+              <w:t xml:space="preserve">=IF(N6="",0,IF(F6="Daily",MAX(0,TODAY()-N6),MAX(0,DATEDIF(N6,TODAY(),"m"))))</w:t>
+            </w:r>
+          </w:p>
+        </w:tc>
+        <w:tc>
+          <w:tcPr>
+            <w:tcW w:w="3800" w:type="dxa"/>
+            <w:vAlign w:val="center"/>
+          </w:tcPr>
+          <w:p>
+            <w:r>
+              <w:rPr>
+                <w:sz w:val="18"/>
+              </w:rPr>
+              <w:t xml:space="preserve">Periods Elapsed: days since the start date for daily accounts, or whole months for monthly accounts, up to TODAY(). Because it uses TODAY(), it grows by itself each time you open the file.</w:t>
+            </w:r>
+          </w:p>
+        </w:tc>
+      </w:tr>
+      <w:tr>
+        <w:tc>
+          <w:tcPr>
+            <w:tcW w:w="1500" w:type="dxa"/>
+            <w:vAlign w:val="center"/>
+          </w:tcPr>
+          <w:p>
+            <w:r>
+              <w:rPr>
+                <w:b/>
+                <w:sz w:val="18"/>
+              </w:rPr>
+              <w:t xml:space="preserve">P6:P19</w:t>
+            </w:r>
+          </w:p>
+        </w:tc>
+        <w:tc>
+          <w:tcPr>
+            <w:tcW w:w="4300" w:type="dxa"/>
+            <w:vAlign w:val="center"/>
+          </w:tcPr>
+          <w:p>
+            <w:r>
+              <w:rPr>
+                <w:rFonts w:ascii="Consolas" w:hAnsi="Consolas"/>
+                <w:color w:val="1F3864"/>
+                <w:sz w:val="18"/>
+              </w:rPr>
+              <w:t xml:space="preserve">=G6*((1+H6)^O6-1)</w:t>
+            </w:r>
+          </w:p>
+        </w:tc>
+        <w:tc>
+          <w:tcPr>
+            <w:tcW w:w="3800" w:type="dxa"/>
+            <w:vAlign w:val="center"/>
+          </w:tcPr>
+          <w:p>
+            <w:r>
+              <w:rPr>
+                <w:sz w:val="18"/>
+              </w:rPr>
+              <w:t xml:space="preserve">Interest to Date: compound interest actually earned from the start date until today.</w:t>
+            </w:r>
+          </w:p>
+        </w:tc>
+      </w:tr>
+      <w:tr>
+        <w:tc>
+          <w:tcPr>
+            <w:tcW w:w="1500" w:type="dxa"/>
+            <w:vAlign w:val="center"/>
+          </w:tcPr>
+          <w:p>
+            <w:r>
+              <w:rPr>
+                <w:b/>
+                <w:sz w:val="18"/>
+              </w:rPr>
+              <w:t xml:space="preserve">Q6:Q19</w:t>
+            </w:r>
+          </w:p>
+        </w:tc>
+        <w:tc>
+          <w:tcPr>
+            <w:tcW w:w="4300" w:type="dxa"/>
+            <w:vAlign w:val="center"/>
+          </w:tcPr>
+          <w:p>
+            <w:r>
+              <w:rPr>
+                <w:rFonts w:ascii="Consolas" w:hAnsi="Consolas"/>
+                <w:color w:val="1F3864"/>
+                <w:sz w:val="18"/>
+              </w:rPr>
+              <w:t xml:space="preserve">=G6+P6</w:t>
+            </w:r>
+          </w:p>
+        </w:tc>
+        <w:tc>
+          <w:tcPr>
+            <w:tcW w:w="3800" w:type="dxa"/>
+            <w:vAlign w:val="center"/>
+          </w:tcPr>
+          <w:p>
+            <w:r>
+              <w:rPr>
+                <w:sz w:val="18"/>
+              </w:rPr>
+              <w:t xml:space="preserve">Balance Today: current balance plus interest to date - the amount that increases on its own each day/month.</w:t>
+            </w:r>
+          </w:p>
+        </w:tc>
+      </w:tr>
+      <w:tr>
+        <w:tc>
+          <w:tcPr>
+            <w:tcW w:w="1500" w:type="dxa"/>
+            <w:vAlign w:val="center"/>
+          </w:tcPr>
+          <w:p>
+            <w:r>
+              <w:rPr>
+                <w:b/>
+                <w:sz w:val="18"/>
+              </w:rPr>
+              <w:t xml:space="preserve">G20,I20,K20,L20,P20,Q20</w:t>
             </w:r>
           </w:p>
         </w:tc>
@@ -1878,7 +2160,7 @@
               <w:rPr>
                 <w:sz w:val="18"/>
               </w:rPr>
-              <w:t xml:space="preserve">Column totals row (same SUM pattern for I, K and L).</w:t>
+              <w:t xml:space="preserve">Column totals row (same SUM pattern for I, K, L, P and Q).</w:t>
             </w:r>
           </w:p>
         </w:tc>
@@ -1886,14 +2168,33 @@
     </w:tbl>
     <w:p>
       <w:pPr>
+        <w:pStyle w:val="Heading1"/>
         <w:spacing w:before="240"/>
+      </w:pPr>
+      <w:r>
+        <w:rPr>
+          <w:b/>
+          <w:color w:val="1F3864"/>
+          <w:sz w:val="26"/>
+        </w:rPr>
+        <w:t xml:space="preserve">How the automatic growth works</w:t>
+      </w:r>
+    </w:p>
+    <w:p>
+      <w:r>
+        <w:t xml:space="preserve">The Interest sheet uses TODAY(), which Excel refreshes every time the file is opened (or recalculated). So each new day, daily-interest accounts grow a little, and each new month, monthly-interest accounts step up - the Balance Today, the Dashboard totals and the Savings-by-Bank pie all rise on their own without you editing anything. Note: this is an estimate of what your money earns; because interest is now accrued automatically, do NOT also record interest as a manual transaction (that would double-count). Actual bank postings and any taxes may differ slightly.</w:t>
+      </w:r>
+    </w:p>
+    <w:p>
+      <w:pPr>
+        <w:spacing w:before="120"/>
       </w:pPr>
       <w:r>
         <w:rPr>
           <w:i/>
           <w:color w:val="808080"/>
         </w:rPr>
-        <w:t xml:space="preserve">Note: these figures currently use example seed data. Replace the entries on the Deposit and Transactions tabs with your real amounts and every formula above recalculates automatically.</w:t>
+        <w:t xml:space="preserve">These figures currently use example seed data. Replace the entries on the Deposit and Transactions tabs with your real amounts and every formula above recalculates automatically.</w:t>
       </w:r>
     </w:p>
     <w:sectPr>

</xml_diff>

<commit_message>
Fix Balance Today/Interest to Date showing 0: replace MINIFS (Excel 2019+) with AGGREGATE (Excel 2010+)
- MINIFS in the Interest Start column errored (#NAME?) on Excel 2016/older,
  cascading to 0 via IFERROR on Interest to Date and Balance Today
- Use AGGREGATE(15,6,...) to find earliest deposit date + ISNUMBER guard
- Updated formula reference .docx
</commit_message>
<xml_diff>
--- a/Digital-Bank-Savings-Tracker-Formulas.docx
+++ b/Digital-Bank-Savings-Tracker-Formulas.docx
@@ -1958,21 +1958,21 @@
                 <w:color w:val="1F3864"/>
                 <w:sz w:val="18"/>
               </w:rPr>
-              <w:t xml:space="preserve">=IF(COUNTIFS(Deposit!$C$6:$C$205,D6)=0,"",MINIFS(Deposit!$A$6:$A$205,Deposit!$C$6:$C$205,D6))</w:t>
-            </w:r>
-          </w:p>
-        </w:tc>
-        <w:tc>
-          <w:tcPr>
-            <w:tcW w:w="3800" w:type="dxa"/>
-            <w:vAlign w:val="center"/>
-          </w:tcPr>
-          <w:p>
-            <w:r>
-              <w:rPr>
-                <w:sz w:val="18"/>
-              </w:rPr>
-              <w:t xml:space="preserve">Interest Start: the earliest deposit date for this account - interest accrues from this date.</w:t>
+              <w:t xml:space="preserve">=IFERROR(AGGREGATE(15,6,Deposit!$A$6:$A$205/(Deposit!$C$6:$C$205=D6),1),"")</w:t>
+            </w:r>
+          </w:p>
+        </w:tc>
+        <w:tc>
+          <w:tcPr>
+            <w:tcW w:w="3800" w:type="dxa"/>
+            <w:vAlign w:val="center"/>
+          </w:tcPr>
+          <w:p>
+            <w:r>
+              <w:rPr>
+                <w:sz w:val="18"/>
+              </w:rPr>
+              <w:t xml:space="preserve">Interest Start: the earliest deposit date for this account - interest accrues from this date. Uses AGGREGATE (Excel 2010+) so it works in older Excel versions too.</w:t>
             </w:r>
           </w:p>
         </w:tc>
@@ -2005,7 +2005,7 @@
                 <w:color w:val="1F3864"/>
                 <w:sz w:val="18"/>
               </w:rPr>
-              <w:t xml:space="preserve">=IF(N6="",0,IF(F6="Daily",MAX(0,TODAY()-N6),MAX(0,DATEDIF(N6,TODAY(),"m"))))</w:t>
+              <w:t xml:space="preserve">=IF(ISNUMBER(N6),IF(F6="Daily",MAX(0,TODAY()-N6),MAX(0,DATEDIF(N6,TODAY(),"m"))),0)</w:t>
             </w:r>
           </w:p>
         </w:tc>

</xml_diff>

<commit_message>
Make Interest Start an editable date value (drop AGGREGATE); accrual now uses only universal functions
- AGGREGATE array lookup returned no match on the user's Excel, leaving Periods Elapsed = 0
- Interest Start is now a plain, editable date (yellow), pre-filled with first deposit date
- Periods Elapsed / Interest to Date / Balance Today use only TODAY, DATEDIF, IF, MAX, ISNUMBER
- Updated formula reference .docx
</commit_message>
<xml_diff>
--- a/Digital-Bank-Savings-Tracker-Formulas.docx
+++ b/Digital-Bank-Savings-Tracker-Formulas.docx
@@ -1958,21 +1958,21 @@
                 <w:color w:val="1F3864"/>
                 <w:sz w:val="18"/>
               </w:rPr>
-              <w:t xml:space="preserve">=IFERROR(AGGREGATE(15,6,Deposit!$A$6:$A$205/(Deposit!$C$6:$C$205=D6),1),"")</w:t>
-            </w:r>
-          </w:p>
-        </w:tc>
-        <w:tc>
-          <w:tcPr>
-            <w:tcW w:w="3800" w:type="dxa"/>
-            <w:vAlign w:val="center"/>
-          </w:tcPr>
-          <w:p>
-            <w:r>
-              <w:rPr>
-                <w:sz w:val="18"/>
-              </w:rPr>
-              <w:t xml:space="preserve">Interest Start: the earliest deposit date for this account - interest accrues from this date. Uses AGGREGATE (Excel 2010+) so it works in older Excel versions too.</w:t>
+              <w:t xml:space="preserve">=(editable date - e.g. 6/1/2026)</w:t>
+            </w:r>
+          </w:p>
+        </w:tc>
+        <w:tc>
+          <w:tcPr>
+            <w:tcW w:w="3800" w:type="dxa"/>
+            <w:vAlign w:val="center"/>
+          </w:tcPr>
+          <w:p>
+            <w:r>
+              <w:rPr>
+                <w:sz w:val="18"/>
+              </w:rPr>
+              <w:t xml:space="preserve">Interest Start: a plain, editable date (highlighted yellow) from which interest accrues. Pre-filled with your first deposit date; type a different date to change it. Kept as a value (not a lookup) so it works on every Excel version.</w:t>
             </w:r>
           </w:p>
         </w:tc>

</xml_diff>

<commit_message>
Post interest earned as auto transactions and fold it into Current Balance
- Transactions tab: new auto-posted Interest ledger (one line per account, Date=TODAY,
  Amount=interest earned to date) beside the manual log; read-only, totals row
- Balance tab: relabeled so Current Balance = Principal (Deposits+Net Tx) + Interest Earned
- Ledger reads from Interest sheet (based on principal only) -> no double-count, no circular ref
- Dashboard labels updated; formula .docx updated
</commit_message>
<xml_diff>
--- a/Digital-Bank-Savings-Tracker-Formulas.docx
+++ b/Digital-Bank-Savings-Tracker-Formulas.docx
@@ -1049,9 +1049,270 @@
     </w:p>
     <w:p>
       <w:r>
-        <w:t xml:space="preserve">These two tabs contain no formulas - they are data-entry tables (Excel Tables with filter dropdowns). You type each deposit/transaction on a new row and the Balance and Dashboard sheets read from them automatically. Columns: Deposit = Date, Bank, Account, Amount, Notes; Transactions = Date, Type, Bank, Account, Amount (use negatives for money out), Notes.</w:t>
+        <w:t xml:space="preserve">The Deposit tab and the LEFT side of the Transactions tab are data-entry tables (Excel Tables with filter dropdowns) - you type each entry on a new row. Columns: Deposit = Date, Bank, Account, Amount, Notes; Transactions = Date, Type, Bank, Account, Amount (use negatives for money out), Notes.</w:t>
       </w:r>
     </w:p>
+    <w:p>
+      <w:r>
+        <w:t xml:space="preserve">The RIGHT side of the Transactions tab is an auto-posted Interest ledger (one line per account, read-only). It is generated by formula, not typed:</w:t>
+      </w:r>
+    </w:p>
+    <w:tbl>
+      <w:tblPr>
+        <w:tblW w:w="9600" w:type="dxa"/>
+        <w:tblBorders>
+          <w:top w:val="single" w:sz="4" w:color="BFBFBF"/>
+          <w:left w:val="single" w:sz="4" w:color="BFBFBF"/>
+          <w:bottom w:val="single" w:sz="4" w:color="BFBFBF"/>
+          <w:right w:val="single" w:sz="4" w:color="BFBFBF"/>
+          <w:insideH w:val="single" w:sz="4" w:color="BFBFBF"/>
+          <w:insideV w:val="single" w:sz="4" w:color="BFBFBF"/>
+        </w:tblBorders>
+      </w:tblPr>
+      <w:tblGrid>
+        <w:gridCol w:w="1500"/>
+        <w:gridCol w:w="4300"/>
+        <w:gridCol w:w="3800"/>
+      </w:tblGrid>
+      <w:tr>
+        <w:tc>
+          <w:tcPr>
+            <w:tcW w:w="1500" w:type="dxa"/>
+            <w:shd w:val="clear" w:color="auto" w:fill="1F3864"/>
+            <w:vAlign w:val="center"/>
+          </w:tcPr>
+          <w:p>
+            <w:r>
+              <w:rPr>
+                <w:b/>
+                <w:color w:val="FFFFFF"/>
+              </w:rPr>
+              <w:t xml:space="preserve">Cell(s)</w:t>
+            </w:r>
+          </w:p>
+        </w:tc>
+        <w:tc>
+          <w:tcPr>
+            <w:tcW w:w="4300" w:type="dxa"/>
+            <w:shd w:val="clear" w:color="auto" w:fill="1F3864"/>
+            <w:vAlign w:val="center"/>
+          </w:tcPr>
+          <w:p>
+            <w:r>
+              <w:rPr>
+                <w:b/>
+                <w:color w:val="FFFFFF"/>
+              </w:rPr>
+              <w:t xml:space="preserve">Formula</w:t>
+            </w:r>
+          </w:p>
+        </w:tc>
+        <w:tc>
+          <w:tcPr>
+            <w:tcW w:w="3800" w:type="dxa"/>
+            <w:shd w:val="clear" w:color="auto" w:fill="1F3864"/>
+            <w:vAlign w:val="center"/>
+          </w:tcPr>
+          <w:p>
+            <w:r>
+              <w:rPr>
+                <w:b/>
+                <w:color w:val="FFFFFF"/>
+              </w:rPr>
+              <w:t xml:space="preserve">What it does</w:t>
+            </w:r>
+          </w:p>
+        </w:tc>
+      </w:tr>
+      <w:tr>
+        <w:tc>
+          <w:tcPr>
+            <w:tcW w:w="1500" w:type="dxa"/>
+            <w:vAlign w:val="center"/>
+          </w:tcPr>
+          <w:p>
+            <w:r>
+              <w:rPr>
+                <w:b/>
+                <w:sz w:val="18"/>
+              </w:rPr>
+              <w:t xml:space="preserve">H6:H19</w:t>
+            </w:r>
+          </w:p>
+        </w:tc>
+        <w:tc>
+          <w:tcPr>
+            <w:tcW w:w="4300" w:type="dxa"/>
+            <w:vAlign w:val="center"/>
+          </w:tcPr>
+          <w:p>
+            <w:r>
+              <w:rPr>
+                <w:rFonts w:ascii="Consolas" w:hAnsi="Consolas"/>
+                <w:color w:val="1F3864"/>
+                <w:sz w:val="18"/>
+              </w:rPr>
+              <w:t xml:space="preserve">=TODAY()</w:t>
+            </w:r>
+          </w:p>
+        </w:tc>
+        <w:tc>
+          <w:tcPr>
+            <w:tcW w:w="3800" w:type="dxa"/>
+            <w:vAlign w:val="center"/>
+          </w:tcPr>
+          <w:p>
+            <w:r>
+              <w:rPr>
+                <w:sz w:val="18"/>
+              </w:rPr>
+              <w:t xml:space="preserve">Date of the interest snapshot (auto).</w:t>
+            </w:r>
+          </w:p>
+        </w:tc>
+      </w:tr>
+      <w:tr>
+        <w:tc>
+          <w:tcPr>
+            <w:tcW w:w="1500" w:type="dxa"/>
+            <w:vAlign w:val="center"/>
+          </w:tcPr>
+          <w:p>
+            <w:r>
+              <w:rPr>
+                <w:b/>
+                <w:sz w:val="18"/>
+              </w:rPr>
+              <w:t xml:space="preserve">I6:I19</w:t>
+            </w:r>
+          </w:p>
+        </w:tc>
+        <w:tc>
+          <w:tcPr>
+            <w:tcW w:w="4300" w:type="dxa"/>
+            <w:vAlign w:val="center"/>
+          </w:tcPr>
+          <w:p>
+            <w:r>
+              <w:rPr>
+                <w:rFonts w:ascii="Consolas" w:hAnsi="Consolas"/>
+                <w:color w:val="1F3864"/>
+                <w:sz w:val="18"/>
+              </w:rPr>
+              <w:t xml:space="preserve">=(text) Interest</w:t>
+            </w:r>
+          </w:p>
+        </w:tc>
+        <w:tc>
+          <w:tcPr>
+            <w:tcW w:w="3800" w:type="dxa"/>
+            <w:vAlign w:val="center"/>
+          </w:tcPr>
+          <w:p>
+            <w:r>
+              <w:rPr>
+                <w:sz w:val="18"/>
+              </w:rPr>
+              <w:t xml:space="preserve">Transaction type.</w:t>
+            </w:r>
+          </w:p>
+        </w:tc>
+      </w:tr>
+      <w:tr>
+        <w:tc>
+          <w:tcPr>
+            <w:tcW w:w="1500" w:type="dxa"/>
+            <w:vAlign w:val="center"/>
+          </w:tcPr>
+          <w:p>
+            <w:r>
+              <w:rPr>
+                <w:b/>
+                <w:sz w:val="18"/>
+              </w:rPr>
+              <w:t xml:space="preserve">L6:L19</w:t>
+            </w:r>
+          </w:p>
+        </w:tc>
+        <w:tc>
+          <w:tcPr>
+            <w:tcW w:w="4300" w:type="dxa"/>
+            <w:vAlign w:val="center"/>
+          </w:tcPr>
+          <w:p>
+            <w:r>
+              <w:rPr>
+                <w:rFonts w:ascii="Consolas" w:hAnsi="Consolas"/>
+                <w:color w:val="1F3864"/>
+                <w:sz w:val="18"/>
+              </w:rPr>
+              <w:t xml:space="preserve">=IFERROR(VLOOKUP(K6,Interest!$D$6:$Q$19,13,FALSE),0)</w:t>
+            </w:r>
+          </w:p>
+        </w:tc>
+        <w:tc>
+          <w:tcPr>
+            <w:tcW w:w="3800" w:type="dxa"/>
+            <w:vAlign w:val="center"/>
+          </w:tcPr>
+          <w:p>
+            <w:r>
+              <w:rPr>
+                <w:sz w:val="18"/>
+              </w:rPr>
+              <w:t xml:space="preserve">Interest earned to date for the account - the same value folded into the Balance sheet's Current Balance. It reads from the Interest sheet (which is based only on principal), so it never double-counts or creates a loop.</w:t>
+            </w:r>
+          </w:p>
+        </w:tc>
+      </w:tr>
+      <w:tr>
+        <w:tc>
+          <w:tcPr>
+            <w:tcW w:w="1500" w:type="dxa"/>
+            <w:vAlign w:val="center"/>
+          </w:tcPr>
+          <w:p>
+            <w:r>
+              <w:rPr>
+                <w:b/>
+                <w:sz w:val="18"/>
+              </w:rPr>
+              <w:t xml:space="preserve">L20</w:t>
+            </w:r>
+          </w:p>
+        </w:tc>
+        <w:tc>
+          <w:tcPr>
+            <w:tcW w:w="4300" w:type="dxa"/>
+            <w:vAlign w:val="center"/>
+          </w:tcPr>
+          <w:p>
+            <w:r>
+              <w:rPr>
+                <w:rFonts w:ascii="Consolas" w:hAnsi="Consolas"/>
+                <w:color w:val="1F3864"/>
+                <w:sz w:val="18"/>
+              </w:rPr>
+              <w:t xml:space="preserve">=SUM(L6:L19)</w:t>
+            </w:r>
+          </w:p>
+        </w:tc>
+        <w:tc>
+          <w:tcPr>
+            <w:tcW w:w="3800" w:type="dxa"/>
+            <w:vAlign w:val="center"/>
+          </w:tcPr>
+          <w:p>
+            <w:r>
+              <w:rPr>
+                <w:sz w:val="18"/>
+              </w:rPr>
+              <w:t xml:space="preserve">Total interest earned to date across all accounts.</w:t>
+            </w:r>
+          </w:p>
+        </w:tc>
+      </w:tr>
+    </w:tbl>
     <w:p>
       <w:pPr>
         <w:pStyle w:val="Heading1"/>
@@ -1274,7 +1535,7 @@
               <w:rPr>
                 <w:sz w:val="18"/>
               </w:rPr>
-              <w:t xml:space="preserve">Current Balance: Deposits plus Net Transactions (money you moved).</w:t>
+              <w:t xml:space="preserve">Principal: Deposits plus Net Transactions (the money you actually moved, before interest).</w:t>
             </w:r>
           </w:p>
         </w:tc>
@@ -1321,7 +1582,7 @@
               <w:rPr>
                 <w:sz w:val="18"/>
               </w:rPr>
-              <w:t xml:space="preserve">Interest to Date: the auto-accrued interest for this account (from the Interest sheet); grows with the date.</w:t>
+              <w:t xml:space="preserve">Interest Earned: the auto-accrued interest for this account (from the Interest sheet); grows with the date. Also shown as an auto-posted line on the Transactions tab.</w:t>
             </w:r>
           </w:p>
         </w:tc>
@@ -1368,7 +1629,7 @@
               <w:rPr>
                 <w:sz w:val="18"/>
               </w:rPr>
-              <w:t xml:space="preserve">Balance Today: current balance plus interest accrued to date. This is the number that increases on its own.</w:t>
+              <w:t xml:space="preserve">Current Balance: Principal plus Interest Earned. This is the balance that increases on its own each day/month.</w:t>
             </w:r>
           </w:p>
         </w:tc>

</xml_diff>

<commit_message>
Fix Transactions layout: stack auto-interest ledger BELOW the log (no shared rows)
- Interest ledger moved from beside the table (shared rows 6-19) to rows 49-62
  so filtering/sorting the manual log no longer hides or scrambles it
- Manual table trimmed to 40 rows (A5:F45) - cleaner, no giant empty striped block
- Balance & Dashboard now use structured refs SUMIFS(tblTransactions[...]) so they
  sum only the manual log, never the auto-interest ledger (no double-count/loop)
- Updated formula .docx
</commit_message>
<xml_diff>
--- a/Digital-Bank-Savings-Tracker-Formulas.docx
+++ b/Digital-Bank-Savings-Tracker-Formulas.docx
@@ -313,7 +313,7 @@
                 <w:color w:val="1F3864"/>
                 <w:sz w:val="18"/>
               </w:rPr>
-              <w:t xml:space="preserve">=-SUMIFS(Transactions!$E$6:$E$205,Transactions!$B$6:$B$205,"Withdrawal")</w:t>
+              <w:t xml:space="preserve">=-SUMIFS(tblTransactions[Amount],tblTransactions[Type],"Withdrawal")</w:t>
             </w:r>
           </w:p>
         </w:tc>
@@ -1054,7 +1054,7 @@
     </w:p>
     <w:p>
       <w:r>
-        <w:t xml:space="preserve">The RIGHT side of the Transactions tab is an auto-posted Interest ledger (one line per account, read-only). It is generated by formula, not typed:</w:t>
+        <w:t xml:space="preserve">Below the Transaction Log (rows 49-62) is an auto-posted Interest ledger - one line per account, read-only, generated by formula (not typed). It sits in separate rows from the log so filtering or sorting the log never affects it:</w:t>
       </w:r>
     </w:p>
     <w:tbl>
@@ -1136,7 +1136,7 @@
                 <w:b/>
                 <w:sz w:val="18"/>
               </w:rPr>
-              <w:t xml:space="preserve">H6:H19</w:t>
+              <w:t xml:space="preserve">A49:A62</w:t>
             </w:r>
           </w:p>
         </w:tc>
@@ -1183,7 +1183,7 @@
                 <w:b/>
                 <w:sz w:val="18"/>
               </w:rPr>
-              <w:t xml:space="preserve">I6:I19</w:t>
+              <w:t xml:space="preserve">B49:B62</w:t>
             </w:r>
           </w:p>
         </w:tc>
@@ -1230,70 +1230,70 @@
                 <w:b/>
                 <w:sz w:val="18"/>
               </w:rPr>
-              <w:t xml:space="preserve">L6:L19</w:t>
-            </w:r>
-          </w:p>
-        </w:tc>
-        <w:tc>
-          <w:tcPr>
-            <w:tcW w:w="4300" w:type="dxa"/>
-            <w:vAlign w:val="center"/>
-          </w:tcPr>
-          <w:p>
-            <w:r>
-              <w:rPr>
-                <w:rFonts w:ascii="Consolas" w:hAnsi="Consolas"/>
-                <w:color w:val="1F3864"/>
-                <w:sz w:val="18"/>
-              </w:rPr>
-              <w:t xml:space="preserve">=IFERROR(VLOOKUP(K6,Interest!$D$6:$Q$19,13,FALSE),0)</w:t>
-            </w:r>
-          </w:p>
-        </w:tc>
-        <w:tc>
-          <w:tcPr>
-            <w:tcW w:w="3800" w:type="dxa"/>
-            <w:vAlign w:val="center"/>
-          </w:tcPr>
-          <w:p>
-            <w:r>
-              <w:rPr>
-                <w:sz w:val="18"/>
-              </w:rPr>
-              <w:t xml:space="preserve">Interest earned to date for the account - the same value folded into the Balance sheet's Current Balance. It reads from the Interest sheet (which is based only on principal), so it never double-counts or creates a loop.</w:t>
-            </w:r>
-          </w:p>
-        </w:tc>
-      </w:tr>
-      <w:tr>
-        <w:tc>
-          <w:tcPr>
-            <w:tcW w:w="1500" w:type="dxa"/>
-            <w:vAlign w:val="center"/>
-          </w:tcPr>
-          <w:p>
-            <w:r>
-              <w:rPr>
-                <w:b/>
-                <w:sz w:val="18"/>
-              </w:rPr>
-              <w:t xml:space="preserve">L20</w:t>
-            </w:r>
-          </w:p>
-        </w:tc>
-        <w:tc>
-          <w:tcPr>
-            <w:tcW w:w="4300" w:type="dxa"/>
-            <w:vAlign w:val="center"/>
-          </w:tcPr>
-          <w:p>
-            <w:r>
-              <w:rPr>
-                <w:rFonts w:ascii="Consolas" w:hAnsi="Consolas"/>
-                <w:color w:val="1F3864"/>
-                <w:sz w:val="18"/>
-              </w:rPr>
-              <w:t xml:space="preserve">=SUM(L6:L19)</w:t>
+              <w:t xml:space="preserve">E49:E62</w:t>
+            </w:r>
+          </w:p>
+        </w:tc>
+        <w:tc>
+          <w:tcPr>
+            <w:tcW w:w="4300" w:type="dxa"/>
+            <w:vAlign w:val="center"/>
+          </w:tcPr>
+          <w:p>
+            <w:r>
+              <w:rPr>
+                <w:rFonts w:ascii="Consolas" w:hAnsi="Consolas"/>
+                <w:color w:val="1F3864"/>
+                <w:sz w:val="18"/>
+              </w:rPr>
+              <w:t xml:space="preserve">=IFERROR(VLOOKUP(D49,Interest!$D$6:$Q$19,13,FALSE),0)</w:t>
+            </w:r>
+          </w:p>
+        </w:tc>
+        <w:tc>
+          <w:tcPr>
+            <w:tcW w:w="3800" w:type="dxa"/>
+            <w:vAlign w:val="center"/>
+          </w:tcPr>
+          <w:p>
+            <w:r>
+              <w:rPr>
+                <w:sz w:val="18"/>
+              </w:rPr>
+              <w:t xml:space="preserve">Interest earned to date for the account - the same value folded into the Balance sheet's Current Balance. It reads from the Interest sheet (based only on principal), so it never double-counts or creates a loop.</w:t>
+            </w:r>
+          </w:p>
+        </w:tc>
+      </w:tr>
+      <w:tr>
+        <w:tc>
+          <w:tcPr>
+            <w:tcW w:w="1500" w:type="dxa"/>
+            <w:vAlign w:val="center"/>
+          </w:tcPr>
+          <w:p>
+            <w:r>
+              <w:rPr>
+                <w:b/>
+                <w:sz w:val="18"/>
+              </w:rPr>
+              <w:t xml:space="preserve">E63</w:t>
+            </w:r>
+          </w:p>
+        </w:tc>
+        <w:tc>
+          <w:tcPr>
+            <w:tcW w:w="4300" w:type="dxa"/>
+            <w:vAlign w:val="center"/>
+          </w:tcPr>
+          <w:p>
+            <w:r>
+              <w:rPr>
+                <w:rFonts w:ascii="Consolas" w:hAnsi="Consolas"/>
+                <w:color w:val="1F3864"/>
+                <w:sz w:val="18"/>
+              </w:rPr>
+              <w:t xml:space="preserve">=SUM(E49:E62)</w:t>
             </w:r>
           </w:p>
         </w:tc>
@@ -1474,21 +1474,21 @@
                 <w:color w:val="1F3864"/>
                 <w:sz w:val="18"/>
               </w:rPr>
-              <w:t xml:space="preserve">=SUMIFS(Transactions!$E$6:$E$205,Transactions!$D$6:$D$205,C6)</w:t>
-            </w:r>
-          </w:p>
-        </w:tc>
-        <w:tc>
-          <w:tcPr>
-            <w:tcW w:w="3800" w:type="dxa"/>
-            <w:vAlign w:val="center"/>
-          </w:tcPr>
-          <w:p>
-            <w:r>
-              <w:rPr>
-                <w:sz w:val="18"/>
-              </w:rPr>
-              <w:t xml:space="preserve">Net Transactions: sum of all Transaction amounts for this account (withdrawals are negative, so they subtract).</w:t>
+              <w:t xml:space="preserve">=SUMIFS(tblTransactions[Amount],tblTransactions[Account],C6)</w:t>
+            </w:r>
+          </w:p>
+        </w:tc>
+        <w:tc>
+          <w:tcPr>
+            <w:tcW w:w="3800" w:type="dxa"/>
+            <w:vAlign w:val="center"/>
+          </w:tcPr>
+          <w:p>
+            <w:r>
+              <w:rPr>
+                <w:sz w:val="18"/>
+              </w:rPr>
+              <w:t xml:space="preserve">Net Transactions: sum of the manual Transaction Log for this account (withdrawals are negative, so they subtract). Uses a structured table reference so it always covers your entries and never the auto-interest ledger.</w:t>
             </w:r>
           </w:p>
         </w:tc>

</xml_diff>

<commit_message>
Remove misleading Interest/Period total (it mixed per-day and per-month figures)
Per-row Interest/Period values are correct (1 day for daily accounts, 1 month for
monthly), but their sum mixes time units, so the total is dropped. True accrued
total remains in the Interest to Date column.
</commit_message>
<xml_diff>
--- a/Digital-Bank-Savings-Tracker-Formulas.docx
+++ b/Digital-Bank-Savings-Tracker-Formulas.docx
@@ -2391,7 +2391,7 @@
                 <w:b/>
                 <w:sz w:val="18"/>
               </w:rPr>
-              <w:t xml:space="preserve">G20,I20,K20,L20,P20,Q20</w:t>
+              <w:t xml:space="preserve">G20,K20,L20,P20,Q20</w:t>
             </w:r>
           </w:p>
         </w:tc>
@@ -2421,7 +2421,7 @@
               <w:rPr>
                 <w:sz w:val="18"/>
               </w:rPr>
-              <w:t xml:space="preserve">Column totals row (same SUM pattern for I, K, L, P and Q).</w:t>
+              <w:t xml:space="preserve">Column totals (same SUM pattern for K, L, P and Q). Interest / Period is intentionally NOT totalled - it mixes per-day and per-month figures, so a sum would be meaningless.</w:t>
             </w:r>
           </w:p>
         </w:tc>

</xml_diff>

<commit_message>
Change Interest/Period to Interest/Day (per-day for all accounts)
- Column now = Current Balance x Annual Rate / 365 for every account (daily & monthly)
- Consistent per-day basis, so the column total is meaningful again (restored)
- Compounding/accrual (Interest to Date, Balance Today) unchanged
- Updated formula .docx
</commit_message>
<xml_diff>
--- a/Digital-Bank-Savings-Tracker-Formulas.docx
+++ b/Digital-Bank-Savings-Tracker-Formulas.docx
@@ -1984,21 +1984,21 @@
                 <w:color w:val="1F3864"/>
                 <w:sz w:val="18"/>
               </w:rPr>
-              <w:t xml:space="preserve">=G6*H6</w:t>
-            </w:r>
-          </w:p>
-        </w:tc>
-        <w:tc>
-          <w:tcPr>
-            <w:tcW w:w="3800" w:type="dxa"/>
-            <w:vAlign w:val="center"/>
-          </w:tcPr>
-          <w:p>
-            <w:r>
-              <w:rPr>
-                <w:sz w:val="18"/>
-              </w:rPr>
-              <w:t xml:space="preserve">Interest / Period: balance x periodic rate = the daily earning (daily accounts) or monthly earning (monthly accounts).</w:t>
+              <w:t xml:space="preserve">=G6*E6/365</w:t>
+            </w:r>
+          </w:p>
+        </w:tc>
+        <w:tc>
+          <w:tcPr>
+            <w:tcW w:w="3800" w:type="dxa"/>
+            <w:vAlign w:val="center"/>
+          </w:tcPr>
+          <w:p>
+            <w:r>
+              <w:rPr>
+                <w:sz w:val="18"/>
+              </w:rPr>
+              <w:t xml:space="preserve">Interest / Day: Current Balance x Annual Rate / 365 = the interest earned in one day, shown for every account so the column totals cleanly.</w:t>
             </w:r>
           </w:p>
         </w:tc>
@@ -2391,7 +2391,7 @@
                 <w:b/>
                 <w:sz w:val="18"/>
               </w:rPr>
-              <w:t xml:space="preserve">G20,K20,L20,P20,Q20</w:t>
+              <w:t xml:space="preserve">G20,I20,K20,L20,P20,Q20</w:t>
             </w:r>
           </w:p>
         </w:tc>
@@ -2421,7 +2421,7 @@
               <w:rPr>
                 <w:sz w:val="18"/>
               </w:rPr>
-              <w:t xml:space="preserve">Column totals (same SUM pattern for K, L, P and Q). Interest / Period is intentionally NOT totalled - it mixes per-day and per-month figures, so a sum would be meaningless.</w:t>
+              <w:t xml:space="preserve">Column totals row (same SUM pattern for I, K, L, P and Q). Interest / Day totals cleanly now that every account is on a per-day basis.</w:t>
             </w:r>
           </w:p>
         </w:tc>

</xml_diff>

<commit_message>
Add Interest/Month column beside Interest/Day; label both as (est.)
- New 'Interest / Month (est.)' column (J) = Balance x Rate/12, right next to 'Interest / Day (est.)'
- Moved the Periods/Yr helper to hidden column R (Proj Balance now uses ^R); no cross-sheet
  VLOOKUP positions changed (P/Q/L/M unchanged) -> zero risk to Balance/Transactions/Dashboard
- Both rate columns visible & adjacent; sheet still fits on screen (visible width 198)
- Updated formula .docx
</commit_message>
<xml_diff>
--- a/Digital-Bank-Savings-Tracker-Formulas.docx
+++ b/Digital-Bank-Savings-Tracker-Formulas.docx
@@ -1998,7 +1998,7 @@
               <w:rPr>
                 <w:sz w:val="18"/>
               </w:rPr>
-              <w:t xml:space="preserve">Interest / Day: Current Balance x Annual Rate / 365 = the interest earned in one day, shown for every account so the column totals cleanly.</w:t>
+              <w:t xml:space="preserve">Interest / Day (est.): Current Balance x Annual Rate / 365 = interest earned in one day, shown for every account.</w:t>
             </w:r>
           </w:p>
         </w:tc>
@@ -2031,6 +2031,382 @@
                 <w:color w:val="1F3864"/>
                 <w:sz w:val="18"/>
               </w:rPr>
+              <w:t xml:space="preserve">=G6*E6/12</w:t>
+            </w:r>
+          </w:p>
+        </w:tc>
+        <w:tc>
+          <w:tcPr>
+            <w:tcW w:w="3800" w:type="dxa"/>
+            <w:vAlign w:val="center"/>
+          </w:tcPr>
+          <w:p>
+            <w:r>
+              <w:rPr>
+                <w:sz w:val="18"/>
+              </w:rPr>
+              <w:t xml:space="preserve">Interest / Month (est.): Current Balance x Annual Rate / 12 = interest earned in one month, shown beside Interest / Day so you can compare both rates.</w:t>
+            </w:r>
+          </w:p>
+        </w:tc>
+      </w:tr>
+      <w:tr>
+        <w:tc>
+          <w:tcPr>
+            <w:tcW w:w="1500" w:type="dxa"/>
+            <w:vAlign w:val="center"/>
+          </w:tcPr>
+          <w:p>
+            <w:r>
+              <w:rPr>
+                <w:b/>
+                <w:sz w:val="18"/>
+              </w:rPr>
+              <w:t xml:space="preserve">K6:K19</w:t>
+            </w:r>
+          </w:p>
+        </w:tc>
+        <w:tc>
+          <w:tcPr>
+            <w:tcW w:w="4300" w:type="dxa"/>
+            <w:vAlign w:val="center"/>
+          </w:tcPr>
+          <w:p>
+            <w:r>
+              <w:rPr>
+                <w:rFonts w:ascii="Consolas" w:hAnsi="Consolas"/>
+                <w:color w:val="1F3864"/>
+                <w:sz w:val="18"/>
+              </w:rPr>
+              <w:t xml:space="preserve">=G6*(1+H6)^R6</w:t>
+            </w:r>
+          </w:p>
+        </w:tc>
+        <w:tc>
+          <w:tcPr>
+            <w:tcW w:w="3800" w:type="dxa"/>
+            <w:vAlign w:val="center"/>
+          </w:tcPr>
+          <w:p>
+            <w:r>
+              <w:rPr>
+                <w:sz w:val="18"/>
+              </w:rPr>
+              <w:t xml:space="preserve">Projected Balance (1 Yr): compound-interest formula balance x (1 + periodic rate) ^ periods (periods come from column R). This is what makes interest grow on itself.</w:t>
+            </w:r>
+          </w:p>
+        </w:tc>
+      </w:tr>
+      <w:tr>
+        <w:tc>
+          <w:tcPr>
+            <w:tcW w:w="1500" w:type="dxa"/>
+            <w:vAlign w:val="center"/>
+          </w:tcPr>
+          <w:p>
+            <w:r>
+              <w:rPr>
+                <w:b/>
+                <w:sz w:val="18"/>
+              </w:rPr>
+              <w:t xml:space="preserve">L6:L19</w:t>
+            </w:r>
+          </w:p>
+        </w:tc>
+        <w:tc>
+          <w:tcPr>
+            <w:tcW w:w="4300" w:type="dxa"/>
+            <w:vAlign w:val="center"/>
+          </w:tcPr>
+          <w:p>
+            <w:r>
+              <w:rPr>
+                <w:rFonts w:ascii="Consolas" w:hAnsi="Consolas"/>
+                <w:color w:val="1F3864"/>
+                <w:sz w:val="18"/>
+              </w:rPr>
+              <w:t xml:space="preserve">=K6-G6</w:t>
+            </w:r>
+          </w:p>
+        </w:tc>
+        <w:tc>
+          <w:tcPr>
+            <w:tcW w:w="3800" w:type="dxa"/>
+            <w:vAlign w:val="center"/>
+          </w:tcPr>
+          <w:p>
+            <w:r>
+              <w:rPr>
+                <w:sz w:val="18"/>
+              </w:rPr>
+              <w:t xml:space="preserve">Interest (1 Yr): projected balance minus starting balance = total interest earned in a year.</w:t>
+            </w:r>
+          </w:p>
+        </w:tc>
+      </w:tr>
+      <w:tr>
+        <w:tc>
+          <w:tcPr>
+            <w:tcW w:w="1500" w:type="dxa"/>
+            <w:vAlign w:val="center"/>
+          </w:tcPr>
+          <w:p>
+            <w:r>
+              <w:rPr>
+                <w:b/>
+                <w:sz w:val="18"/>
+              </w:rPr>
+              <w:t xml:space="preserve">M6:M19</w:t>
+            </w:r>
+          </w:p>
+        </w:tc>
+        <w:tc>
+          <w:tcPr>
+            <w:tcW w:w="4300" w:type="dxa"/>
+            <w:vAlign w:val="center"/>
+          </w:tcPr>
+          <w:p>
+            <w:r>
+              <w:rPr>
+                <w:rFonts w:ascii="Consolas" w:hAnsi="Consolas"/>
+                <w:color w:val="1F3864"/>
+                <w:sz w:val="18"/>
+              </w:rPr>
+              <w:t xml:space="preserve">=IF(F6="Daily",(1+E6/365)^(365/12),1+E6/12)</w:t>
+            </w:r>
+          </w:p>
+        </w:tc>
+        <w:tc>
+          <w:tcPr>
+            <w:tcW w:w="3800" w:type="dxa"/>
+            <w:vAlign w:val="center"/>
+          </w:tcPr>
+          <w:p>
+            <w:r>
+              <w:rPr>
+                <w:sz w:val="18"/>
+              </w:rPr>
+              <w:t xml:space="preserve">Monthly Growth Factor: how much 1 peso grows in one month (used by the Dashboard growth/interest charts).</w:t>
+            </w:r>
+          </w:p>
+        </w:tc>
+      </w:tr>
+      <w:tr>
+        <w:tc>
+          <w:tcPr>
+            <w:tcW w:w="1500" w:type="dxa"/>
+            <w:vAlign w:val="center"/>
+          </w:tcPr>
+          <w:p>
+            <w:r>
+              <w:rPr>
+                <w:b/>
+                <w:sz w:val="18"/>
+              </w:rPr>
+              <w:t xml:space="preserve">N6:N19</w:t>
+            </w:r>
+          </w:p>
+        </w:tc>
+        <w:tc>
+          <w:tcPr>
+            <w:tcW w:w="4300" w:type="dxa"/>
+            <w:vAlign w:val="center"/>
+          </w:tcPr>
+          <w:p>
+            <w:r>
+              <w:rPr>
+                <w:rFonts w:ascii="Consolas" w:hAnsi="Consolas"/>
+                <w:color w:val="1F3864"/>
+                <w:sz w:val="18"/>
+              </w:rPr>
+              <w:t xml:space="preserve">=(editable date - e.g. 6/1/2026)</w:t>
+            </w:r>
+          </w:p>
+        </w:tc>
+        <w:tc>
+          <w:tcPr>
+            <w:tcW w:w="3800" w:type="dxa"/>
+            <w:vAlign w:val="center"/>
+          </w:tcPr>
+          <w:p>
+            <w:r>
+              <w:rPr>
+                <w:sz w:val="18"/>
+              </w:rPr>
+              <w:t xml:space="preserve">Interest Start: a plain, editable date (highlighted yellow) from which interest accrues. Pre-filled with your first deposit date; type a different date to change it. Kept as a value (not a lookup) so it works on every Excel version.</w:t>
+            </w:r>
+          </w:p>
+        </w:tc>
+      </w:tr>
+      <w:tr>
+        <w:tc>
+          <w:tcPr>
+            <w:tcW w:w="1500" w:type="dxa"/>
+            <w:vAlign w:val="center"/>
+          </w:tcPr>
+          <w:p>
+            <w:r>
+              <w:rPr>
+                <w:b/>
+                <w:sz w:val="18"/>
+              </w:rPr>
+              <w:t xml:space="preserve">O6:O19</w:t>
+            </w:r>
+          </w:p>
+        </w:tc>
+        <w:tc>
+          <w:tcPr>
+            <w:tcW w:w="4300" w:type="dxa"/>
+            <w:vAlign w:val="center"/>
+          </w:tcPr>
+          <w:p>
+            <w:r>
+              <w:rPr>
+                <w:rFonts w:ascii="Consolas" w:hAnsi="Consolas"/>
+                <w:color w:val="1F3864"/>
+                <w:sz w:val="18"/>
+              </w:rPr>
+              <w:t xml:space="preserve">=IF(ISNUMBER(N6),IF(F6="Daily",MAX(0,TODAY()-N6),MAX(0,DATEDIF(N6,TODAY(),"m"))),0)</w:t>
+            </w:r>
+          </w:p>
+        </w:tc>
+        <w:tc>
+          <w:tcPr>
+            <w:tcW w:w="3800" w:type="dxa"/>
+            <w:vAlign w:val="center"/>
+          </w:tcPr>
+          <w:p>
+            <w:r>
+              <w:rPr>
+                <w:sz w:val="18"/>
+              </w:rPr>
+              <w:t xml:space="preserve">Periods Elapsed: days since the start date for daily accounts, or whole months for monthly accounts, up to TODAY(). Because it uses TODAY(), it grows by itself each time you open the file.</w:t>
+            </w:r>
+          </w:p>
+        </w:tc>
+      </w:tr>
+      <w:tr>
+        <w:tc>
+          <w:tcPr>
+            <w:tcW w:w="1500" w:type="dxa"/>
+            <w:vAlign w:val="center"/>
+          </w:tcPr>
+          <w:p>
+            <w:r>
+              <w:rPr>
+                <w:b/>
+                <w:sz w:val="18"/>
+              </w:rPr>
+              <w:t xml:space="preserve">P6:P19</w:t>
+            </w:r>
+          </w:p>
+        </w:tc>
+        <w:tc>
+          <w:tcPr>
+            <w:tcW w:w="4300" w:type="dxa"/>
+            <w:vAlign w:val="center"/>
+          </w:tcPr>
+          <w:p>
+            <w:r>
+              <w:rPr>
+                <w:rFonts w:ascii="Consolas" w:hAnsi="Consolas"/>
+                <w:color w:val="1F3864"/>
+                <w:sz w:val="18"/>
+              </w:rPr>
+              <w:t xml:space="preserve">=G6*((1+H6)^O6-1)</w:t>
+            </w:r>
+          </w:p>
+        </w:tc>
+        <w:tc>
+          <w:tcPr>
+            <w:tcW w:w="3800" w:type="dxa"/>
+            <w:vAlign w:val="center"/>
+          </w:tcPr>
+          <w:p>
+            <w:r>
+              <w:rPr>
+                <w:sz w:val="18"/>
+              </w:rPr>
+              <w:t xml:space="preserve">Interest to Date: compound interest actually earned from the start date until today.</w:t>
+            </w:r>
+          </w:p>
+        </w:tc>
+      </w:tr>
+      <w:tr>
+        <w:tc>
+          <w:tcPr>
+            <w:tcW w:w="1500" w:type="dxa"/>
+            <w:vAlign w:val="center"/>
+          </w:tcPr>
+          <w:p>
+            <w:r>
+              <w:rPr>
+                <w:b/>
+                <w:sz w:val="18"/>
+              </w:rPr>
+              <w:t xml:space="preserve">Q6:Q19</w:t>
+            </w:r>
+          </w:p>
+        </w:tc>
+        <w:tc>
+          <w:tcPr>
+            <w:tcW w:w="4300" w:type="dxa"/>
+            <w:vAlign w:val="center"/>
+          </w:tcPr>
+          <w:p>
+            <w:r>
+              <w:rPr>
+                <w:rFonts w:ascii="Consolas" w:hAnsi="Consolas"/>
+                <w:color w:val="1F3864"/>
+                <w:sz w:val="18"/>
+              </w:rPr>
+              <w:t xml:space="preserve">=G6+P6</w:t>
+            </w:r>
+          </w:p>
+        </w:tc>
+        <w:tc>
+          <w:tcPr>
+            <w:tcW w:w="3800" w:type="dxa"/>
+            <w:vAlign w:val="center"/>
+          </w:tcPr>
+          <w:p>
+            <w:r>
+              <w:rPr>
+                <w:sz w:val="18"/>
+              </w:rPr>
+              <w:t xml:space="preserve">Balance Today: current balance plus interest to date - the amount that increases on its own each day/month.</w:t>
+            </w:r>
+          </w:p>
+        </w:tc>
+      </w:tr>
+      <w:tr>
+        <w:tc>
+          <w:tcPr>
+            <w:tcW w:w="1500" w:type="dxa"/>
+            <w:vAlign w:val="center"/>
+          </w:tcPr>
+          <w:p>
+            <w:r>
+              <w:rPr>
+                <w:b/>
+                <w:sz w:val="18"/>
+              </w:rPr>
+              <w:t xml:space="preserve">R6:R19</w:t>
+            </w:r>
+          </w:p>
+        </w:tc>
+        <w:tc>
+          <w:tcPr>
+            <w:tcW w:w="4300" w:type="dxa"/>
+            <w:vAlign w:val="center"/>
+          </w:tcPr>
+          <w:p>
+            <w:r>
+              <w:rPr>
+                <w:rFonts w:ascii="Consolas" w:hAnsi="Consolas"/>
+                <w:color w:val="1F3864"/>
+                <w:sz w:val="18"/>
+              </w:rPr>
               <w:t xml:space="preserve">=IF(F6="Daily",365,12)</w:t>
             </w:r>
           </w:p>
@@ -2045,353 +2421,24 @@
               <w:rPr>
                 <w:sz w:val="18"/>
               </w:rPr>
-              <w:t xml:space="preserve">Periods / Yr: 365 for daily accounts, 12 for monthly.</w:t>
-            </w:r>
-          </w:p>
-        </w:tc>
-      </w:tr>
-      <w:tr>
-        <w:tc>
-          <w:tcPr>
-            <w:tcW w:w="1500" w:type="dxa"/>
-            <w:vAlign w:val="center"/>
-          </w:tcPr>
-          <w:p>
-            <w:r>
-              <w:rPr>
-                <w:b/>
-                <w:sz w:val="18"/>
-              </w:rPr>
-              <w:t xml:space="preserve">K6:K19</w:t>
-            </w:r>
-          </w:p>
-        </w:tc>
-        <w:tc>
-          <w:tcPr>
-            <w:tcW w:w="4300" w:type="dxa"/>
-            <w:vAlign w:val="center"/>
-          </w:tcPr>
-          <w:p>
-            <w:r>
-              <w:rPr>
-                <w:rFonts w:ascii="Consolas" w:hAnsi="Consolas"/>
-                <w:color w:val="1F3864"/>
-                <w:sz w:val="18"/>
-              </w:rPr>
-              <w:t xml:space="preserve">=G6*(1+H6)^J6</w:t>
-            </w:r>
-          </w:p>
-        </w:tc>
-        <w:tc>
-          <w:tcPr>
-            <w:tcW w:w="3800" w:type="dxa"/>
-            <w:vAlign w:val="center"/>
-          </w:tcPr>
-          <w:p>
-            <w:r>
-              <w:rPr>
-                <w:sz w:val="18"/>
-              </w:rPr>
-              <w:t xml:space="preserve">Projected Balance (1 Yr): compound-interest formula balance x (1 + periodic rate) ^ periods. This is what makes interest grow on itself.</w:t>
-            </w:r>
-          </w:p>
-        </w:tc>
-      </w:tr>
-      <w:tr>
-        <w:tc>
-          <w:tcPr>
-            <w:tcW w:w="1500" w:type="dxa"/>
-            <w:vAlign w:val="center"/>
-          </w:tcPr>
-          <w:p>
-            <w:r>
-              <w:rPr>
-                <w:b/>
-                <w:sz w:val="18"/>
-              </w:rPr>
-              <w:t xml:space="preserve">L6:L19</w:t>
-            </w:r>
-          </w:p>
-        </w:tc>
-        <w:tc>
-          <w:tcPr>
-            <w:tcW w:w="4300" w:type="dxa"/>
-            <w:vAlign w:val="center"/>
-          </w:tcPr>
-          <w:p>
-            <w:r>
-              <w:rPr>
-                <w:rFonts w:ascii="Consolas" w:hAnsi="Consolas"/>
-                <w:color w:val="1F3864"/>
-                <w:sz w:val="18"/>
-              </w:rPr>
-              <w:t xml:space="preserve">=K6-G6</w:t>
-            </w:r>
-          </w:p>
-        </w:tc>
-        <w:tc>
-          <w:tcPr>
-            <w:tcW w:w="3800" w:type="dxa"/>
-            <w:vAlign w:val="center"/>
-          </w:tcPr>
-          <w:p>
-            <w:r>
-              <w:rPr>
-                <w:sz w:val="18"/>
-              </w:rPr>
-              <w:t xml:space="preserve">Interest (1 Yr): projected balance minus starting balance = total interest earned in a year.</w:t>
-            </w:r>
-          </w:p>
-        </w:tc>
-      </w:tr>
-      <w:tr>
-        <w:tc>
-          <w:tcPr>
-            <w:tcW w:w="1500" w:type="dxa"/>
-            <w:vAlign w:val="center"/>
-          </w:tcPr>
-          <w:p>
-            <w:r>
-              <w:rPr>
-                <w:b/>
-                <w:sz w:val="18"/>
-              </w:rPr>
-              <w:t xml:space="preserve">M6:M19</w:t>
-            </w:r>
-          </w:p>
-        </w:tc>
-        <w:tc>
-          <w:tcPr>
-            <w:tcW w:w="4300" w:type="dxa"/>
-            <w:vAlign w:val="center"/>
-          </w:tcPr>
-          <w:p>
-            <w:r>
-              <w:rPr>
-                <w:rFonts w:ascii="Consolas" w:hAnsi="Consolas"/>
-                <w:color w:val="1F3864"/>
-                <w:sz w:val="18"/>
-              </w:rPr>
-              <w:t xml:space="preserve">=IF(F6="Daily",(1+E6/365)^(365/12),1+E6/12)</w:t>
-            </w:r>
-          </w:p>
-        </w:tc>
-        <w:tc>
-          <w:tcPr>
-            <w:tcW w:w="3800" w:type="dxa"/>
-            <w:vAlign w:val="center"/>
-          </w:tcPr>
-          <w:p>
-            <w:r>
-              <w:rPr>
-                <w:sz w:val="18"/>
-              </w:rPr>
-              <w:t xml:space="preserve">Monthly Growth Factor: how much 1 peso grows in one month (used by the Dashboard growth/interest charts).</w:t>
-            </w:r>
-          </w:p>
-        </w:tc>
-      </w:tr>
-      <w:tr>
-        <w:tc>
-          <w:tcPr>
-            <w:tcW w:w="1500" w:type="dxa"/>
-            <w:vAlign w:val="center"/>
-          </w:tcPr>
-          <w:p>
-            <w:r>
-              <w:rPr>
-                <w:b/>
-                <w:sz w:val="18"/>
-              </w:rPr>
-              <w:t xml:space="preserve">N6:N19</w:t>
-            </w:r>
-          </w:p>
-        </w:tc>
-        <w:tc>
-          <w:tcPr>
-            <w:tcW w:w="4300" w:type="dxa"/>
-            <w:vAlign w:val="center"/>
-          </w:tcPr>
-          <w:p>
-            <w:r>
-              <w:rPr>
-                <w:rFonts w:ascii="Consolas" w:hAnsi="Consolas"/>
-                <w:color w:val="1F3864"/>
-                <w:sz w:val="18"/>
-              </w:rPr>
-              <w:t xml:space="preserve">=(editable date - e.g. 6/1/2026)</w:t>
-            </w:r>
-          </w:p>
-        </w:tc>
-        <w:tc>
-          <w:tcPr>
-            <w:tcW w:w="3800" w:type="dxa"/>
-            <w:vAlign w:val="center"/>
-          </w:tcPr>
-          <w:p>
-            <w:r>
-              <w:rPr>
-                <w:sz w:val="18"/>
-              </w:rPr>
-              <w:t xml:space="preserve">Interest Start: a plain, editable date (highlighted yellow) from which interest accrues. Pre-filled with your first deposit date; type a different date to change it. Kept as a value (not a lookup) so it works on every Excel version.</w:t>
-            </w:r>
-          </w:p>
-        </w:tc>
-      </w:tr>
-      <w:tr>
-        <w:tc>
-          <w:tcPr>
-            <w:tcW w:w="1500" w:type="dxa"/>
-            <w:vAlign w:val="center"/>
-          </w:tcPr>
-          <w:p>
-            <w:r>
-              <w:rPr>
-                <w:b/>
-                <w:sz w:val="18"/>
-              </w:rPr>
-              <w:t xml:space="preserve">O6:O19</w:t>
-            </w:r>
-          </w:p>
-        </w:tc>
-        <w:tc>
-          <w:tcPr>
-            <w:tcW w:w="4300" w:type="dxa"/>
-            <w:vAlign w:val="center"/>
-          </w:tcPr>
-          <w:p>
-            <w:r>
-              <w:rPr>
-                <w:rFonts w:ascii="Consolas" w:hAnsi="Consolas"/>
-                <w:color w:val="1F3864"/>
-                <w:sz w:val="18"/>
-              </w:rPr>
-              <w:t xml:space="preserve">=IF(ISNUMBER(N6),IF(F6="Daily",MAX(0,TODAY()-N6),MAX(0,DATEDIF(N6,TODAY(),"m"))),0)</w:t>
-            </w:r>
-          </w:p>
-        </w:tc>
-        <w:tc>
-          <w:tcPr>
-            <w:tcW w:w="3800" w:type="dxa"/>
-            <w:vAlign w:val="center"/>
-          </w:tcPr>
-          <w:p>
-            <w:r>
-              <w:rPr>
-                <w:sz w:val="18"/>
-              </w:rPr>
-              <w:t xml:space="preserve">Periods Elapsed: days since the start date for daily accounts, or whole months for monthly accounts, up to TODAY(). Because it uses TODAY(), it grows by itself each time you open the file.</w:t>
-            </w:r>
-          </w:p>
-        </w:tc>
-      </w:tr>
-      <w:tr>
-        <w:tc>
-          <w:tcPr>
-            <w:tcW w:w="1500" w:type="dxa"/>
-            <w:vAlign w:val="center"/>
-          </w:tcPr>
-          <w:p>
-            <w:r>
-              <w:rPr>
-                <w:b/>
-                <w:sz w:val="18"/>
-              </w:rPr>
-              <w:t xml:space="preserve">P6:P19</w:t>
-            </w:r>
-          </w:p>
-        </w:tc>
-        <w:tc>
-          <w:tcPr>
-            <w:tcW w:w="4300" w:type="dxa"/>
-            <w:vAlign w:val="center"/>
-          </w:tcPr>
-          <w:p>
-            <w:r>
-              <w:rPr>
-                <w:rFonts w:ascii="Consolas" w:hAnsi="Consolas"/>
-                <w:color w:val="1F3864"/>
-                <w:sz w:val="18"/>
-              </w:rPr>
-              <w:t xml:space="preserve">=G6*((1+H6)^O6-1)</w:t>
-            </w:r>
-          </w:p>
-        </w:tc>
-        <w:tc>
-          <w:tcPr>
-            <w:tcW w:w="3800" w:type="dxa"/>
-            <w:vAlign w:val="center"/>
-          </w:tcPr>
-          <w:p>
-            <w:r>
-              <w:rPr>
-                <w:sz w:val="18"/>
-              </w:rPr>
-              <w:t xml:space="preserve">Interest to Date: compound interest actually earned from the start date until today.</w:t>
-            </w:r>
-          </w:p>
-        </w:tc>
-      </w:tr>
-      <w:tr>
-        <w:tc>
-          <w:tcPr>
-            <w:tcW w:w="1500" w:type="dxa"/>
-            <w:vAlign w:val="center"/>
-          </w:tcPr>
-          <w:p>
-            <w:r>
-              <w:rPr>
-                <w:b/>
-                <w:sz w:val="18"/>
-              </w:rPr>
-              <w:t xml:space="preserve">Q6:Q19</w:t>
-            </w:r>
-          </w:p>
-        </w:tc>
-        <w:tc>
-          <w:tcPr>
-            <w:tcW w:w="4300" w:type="dxa"/>
-            <w:vAlign w:val="center"/>
-          </w:tcPr>
-          <w:p>
-            <w:r>
-              <w:rPr>
-                <w:rFonts w:ascii="Consolas" w:hAnsi="Consolas"/>
-                <w:color w:val="1F3864"/>
-                <w:sz w:val="18"/>
-              </w:rPr>
-              <w:t xml:space="preserve">=G6+P6</w:t>
-            </w:r>
-          </w:p>
-        </w:tc>
-        <w:tc>
-          <w:tcPr>
-            <w:tcW w:w="3800" w:type="dxa"/>
-            <w:vAlign w:val="center"/>
-          </w:tcPr>
-          <w:p>
-            <w:r>
-              <w:rPr>
-                <w:sz w:val="18"/>
-              </w:rPr>
-              <w:t xml:space="preserve">Balance Today: current balance plus interest to date - the amount that increases on its own each day/month.</w:t>
-            </w:r>
-          </w:p>
-        </w:tc>
-      </w:tr>
-      <w:tr>
-        <w:tc>
-          <w:tcPr>
-            <w:tcW w:w="1500" w:type="dxa"/>
-            <w:vAlign w:val="center"/>
-          </w:tcPr>
-          <w:p>
-            <w:r>
-              <w:rPr>
-                <w:b/>
-                <w:sz w:val="18"/>
-              </w:rPr>
-              <w:t xml:space="preserve">G20,I20,K20,L20,P20,Q20</w:t>
+              <w:t xml:space="preserve">Periods / Yr (hidden helper): 365 for daily accounts, 12 for monthly - used by the 1-year projection in column K.</w:t>
+            </w:r>
+          </w:p>
+        </w:tc>
+      </w:tr>
+      <w:tr>
+        <w:tc>
+          <w:tcPr>
+            <w:tcW w:w="1500" w:type="dxa"/>
+            <w:vAlign w:val="center"/>
+          </w:tcPr>
+          <w:p>
+            <w:r>
+              <w:rPr>
+                <w:b/>
+                <w:sz w:val="18"/>
+              </w:rPr>
+              <w:t xml:space="preserve">G20,I20,J20,K20,L20,P20,Q20</w:t>
             </w:r>
           </w:p>
         </w:tc>
@@ -2421,7 +2468,7 @@
               <w:rPr>
                 <w:sz w:val="18"/>
               </w:rPr>
-              <w:t xml:space="preserve">Column totals row (same SUM pattern for I, K, L, P and Q). Interest / Day totals cleanly now that every account is on a per-day basis.</w:t>
+              <w:t xml:space="preserve">Column totals row (same SUM pattern for I, J, K, L, P and Q). Interest / Day and Interest / Month each total cleanly since every account is on the same basis.</w:t>
             </w:r>
           </w:p>
         </w:tc>

</xml_diff>

<commit_message>
Make auto-interest ledger visible: shrink log to 20 rows so interest sits just below it (rows 22-38)
</commit_message>
<xml_diff>
--- a/Digital-Bank-Savings-Tracker-Formulas.docx
+++ b/Digital-Bank-Savings-Tracker-Formulas.docx
@@ -1054,7 +1054,7 @@
     </w:p>
     <w:p>
       <w:r>
-        <w:t xml:space="preserve">Below the Transaction Log (rows 49-62) is an auto-posted Interest ledger - one line per account, read-only, generated by formula (not typed). It sits in separate rows from the log so filtering or sorting the log never affects it:</w:t>
+        <w:t xml:space="preserve">Just below the Transaction Log (rows 22-38) is an auto-posted Interest ledger - one line per account, read-only, generated by formula (not typed). It sits in separate rows from the log so filtering or sorting the log never affects it:</w:t>
       </w:r>
     </w:p>
     <w:tbl>
@@ -1136,7 +1136,7 @@
                 <w:b/>
                 <w:sz w:val="18"/>
               </w:rPr>
-              <w:t xml:space="preserve">A49:A62</w:t>
+              <w:t xml:space="preserve">A24:A37</w:t>
             </w:r>
           </w:p>
         </w:tc>
@@ -1183,7 +1183,7 @@
                 <w:b/>
                 <w:sz w:val="18"/>
               </w:rPr>
-              <w:t xml:space="preserve">B49:B62</w:t>
+              <w:t xml:space="preserve">B24:B37</w:t>
             </w:r>
           </w:p>
         </w:tc>
@@ -1230,23 +1230,23 @@
                 <w:b/>
                 <w:sz w:val="18"/>
               </w:rPr>
-              <w:t xml:space="preserve">E49:E62</w:t>
-            </w:r>
-          </w:p>
-        </w:tc>
-        <w:tc>
-          <w:tcPr>
-            <w:tcW w:w="4300" w:type="dxa"/>
-            <w:vAlign w:val="center"/>
-          </w:tcPr>
-          <w:p>
-            <w:r>
-              <w:rPr>
-                <w:rFonts w:ascii="Consolas" w:hAnsi="Consolas"/>
-                <w:color w:val="1F3864"/>
-                <w:sz w:val="18"/>
-              </w:rPr>
-              <w:t xml:space="preserve">=IFERROR(VLOOKUP(D49,Interest!$D$6:$Q$19,13,FALSE),0)</w:t>
+              <w:t xml:space="preserve">E24:E37</w:t>
+            </w:r>
+          </w:p>
+        </w:tc>
+        <w:tc>
+          <w:tcPr>
+            <w:tcW w:w="4300" w:type="dxa"/>
+            <w:vAlign w:val="center"/>
+          </w:tcPr>
+          <w:p>
+            <w:r>
+              <w:rPr>
+                <w:rFonts w:ascii="Consolas" w:hAnsi="Consolas"/>
+                <w:color w:val="1F3864"/>
+                <w:sz w:val="18"/>
+              </w:rPr>
+              <w:t xml:space="preserve">=IFERROR(VLOOKUP(D24,Interest!$D$6:$Q$19,13,FALSE),0)</w:t>
             </w:r>
           </w:p>
         </w:tc>
@@ -1277,23 +1277,23 @@
                 <w:b/>
                 <w:sz w:val="18"/>
               </w:rPr>
-              <w:t xml:space="preserve">E63</w:t>
-            </w:r>
-          </w:p>
-        </w:tc>
-        <w:tc>
-          <w:tcPr>
-            <w:tcW w:w="4300" w:type="dxa"/>
-            <w:vAlign w:val="center"/>
-          </w:tcPr>
-          <w:p>
-            <w:r>
-              <w:rPr>
-                <w:rFonts w:ascii="Consolas" w:hAnsi="Consolas"/>
-                <w:color w:val="1F3864"/>
-                <w:sz w:val="18"/>
-              </w:rPr>
-              <w:t xml:space="preserve">=SUM(E49:E62)</w:t>
+              <w:t xml:space="preserve">E38</w:t>
+            </w:r>
+          </w:p>
+        </w:tc>
+        <w:tc>
+          <w:tcPr>
+            <w:tcW w:w="4300" w:type="dxa"/>
+            <w:vAlign w:val="center"/>
+          </w:tcPr>
+          <w:p>
+            <w:r>
+              <w:rPr>
+                <w:rFonts w:ascii="Consolas" w:hAnsi="Consolas"/>
+                <w:color w:val="1F3864"/>
+                <w:sz w:val="18"/>
+              </w:rPr>
+              <w:t xml:space="preserve">=SUM(E24:E37)</w:t>
             </w:r>
           </w:p>
         </w:tc>

</xml_diff>

<commit_message>
Move interest ledger ABOVE the transaction log so the log grows freely (no collision/cleanup)
- Interest Earned (auto-posted) now at top (rows 4-20); Transaction Log below (from row 22)
- Log has nothing beneath it -> it auto-extends downward indefinitely as you add rows; no manual cleanup
- Filtering/sorting the log still can't touch interest (separate rows above)
- Balance keeps structured-ref SUMIFS so it auto-adjusts to any log size
</commit_message>
<xml_diff>
--- a/Digital-Bank-Savings-Tracker-Formulas.docx
+++ b/Digital-Bank-Savings-Tracker-Formulas.docx
@@ -1049,12 +1049,12 @@
     </w:p>
     <w:p>
       <w:r>
-        <w:t xml:space="preserve">The Deposit tab and the LEFT side of the Transactions tab are data-entry tables (Excel Tables with filter dropdowns) - you type each entry on a new row. Columns: Deposit = Date, Bank, Account, Amount, Notes; Transactions = Date, Type, Bank, Account, Amount (use negatives for money out), Notes.</w:t>
+        <w:t xml:space="preserve">The Deposit tab and the Transaction Log (lower part of the Transactions tab) are data-entry tables (Excel Tables with filter dropdowns) - you type each entry on a new row. Columns: Deposit = Date, Bank, Account, Amount, Notes; Transaction Log = Date, Type, Bank, Account, Amount (use negatives for money out), Notes. The Transaction Log has nothing beneath it, so it can grow as long as you need.</w:t>
       </w:r>
     </w:p>
     <w:p>
       <w:r>
-        <w:t xml:space="preserve">Just below the Transaction Log (rows 22-38) is an auto-posted Interest ledger - one line per account, read-only, generated by formula (not typed). It sits in separate rows from the log so filtering or sorting the log never affects it:</w:t>
+        <w:t xml:space="preserve">At the TOP of the Transactions tab (rows 4-20) is an auto-posted Interest ledger - one line per account, read-only, generated by formula (not typed). It is kept above the log so the log can grow freely, and it sits in separate rows so filtering/sorting the log never affects it:</w:t>
       </w:r>
     </w:p>
     <w:tbl>
@@ -1136,7 +1136,7 @@
                 <w:b/>
                 <w:sz w:val="18"/>
               </w:rPr>
-              <w:t xml:space="preserve">A24:A37</w:t>
+              <w:t xml:space="preserve">A6:A19</w:t>
             </w:r>
           </w:p>
         </w:tc>
@@ -1183,7 +1183,7 @@
                 <w:b/>
                 <w:sz w:val="18"/>
               </w:rPr>
-              <w:t xml:space="preserve">B24:B37</w:t>
+              <w:t xml:space="preserve">B6:B19</w:t>
             </w:r>
           </w:p>
         </w:tc>
@@ -1230,23 +1230,23 @@
                 <w:b/>
                 <w:sz w:val="18"/>
               </w:rPr>
-              <w:t xml:space="preserve">E24:E37</w:t>
-            </w:r>
-          </w:p>
-        </w:tc>
-        <w:tc>
-          <w:tcPr>
-            <w:tcW w:w="4300" w:type="dxa"/>
-            <w:vAlign w:val="center"/>
-          </w:tcPr>
-          <w:p>
-            <w:r>
-              <w:rPr>
-                <w:rFonts w:ascii="Consolas" w:hAnsi="Consolas"/>
-                <w:color w:val="1F3864"/>
-                <w:sz w:val="18"/>
-              </w:rPr>
-              <w:t xml:space="preserve">=IFERROR(VLOOKUP(D24,Interest!$D$6:$Q$19,13,FALSE),0)</w:t>
+              <w:t xml:space="preserve">E6:E19</w:t>
+            </w:r>
+          </w:p>
+        </w:tc>
+        <w:tc>
+          <w:tcPr>
+            <w:tcW w:w="4300" w:type="dxa"/>
+            <w:vAlign w:val="center"/>
+          </w:tcPr>
+          <w:p>
+            <w:r>
+              <w:rPr>
+                <w:rFonts w:ascii="Consolas" w:hAnsi="Consolas"/>
+                <w:color w:val="1F3864"/>
+                <w:sz w:val="18"/>
+              </w:rPr>
+              <w:t xml:space="preserve">=IFERROR(VLOOKUP(D6,Interest!$D$6:$Q$19,13,FALSE),0)</w:t>
             </w:r>
           </w:p>
         </w:tc>
@@ -1277,23 +1277,23 @@
                 <w:b/>
                 <w:sz w:val="18"/>
               </w:rPr>
-              <w:t xml:space="preserve">E38</w:t>
-            </w:r>
-          </w:p>
-        </w:tc>
-        <w:tc>
-          <w:tcPr>
-            <w:tcW w:w="4300" w:type="dxa"/>
-            <w:vAlign w:val="center"/>
-          </w:tcPr>
-          <w:p>
-            <w:r>
-              <w:rPr>
-                <w:rFonts w:ascii="Consolas" w:hAnsi="Consolas"/>
-                <w:color w:val="1F3864"/>
-                <w:sz w:val="18"/>
-              </w:rPr>
-              <w:t xml:space="preserve">=SUM(E24:E37)</w:t>
+              <w:t xml:space="preserve">E20</w:t>
+            </w:r>
+          </w:p>
+        </w:tc>
+        <w:tc>
+          <w:tcPr>
+            <w:tcW w:w="4300" w:type="dxa"/>
+            <w:vAlign w:val="center"/>
+          </w:tcPr>
+          <w:p>
+            <w:r>
+              <w:rPr>
+                <w:rFonts w:ascii="Consolas" w:hAnsi="Consolas"/>
+                <w:color w:val="1F3864"/>
+                <w:sz w:val="18"/>
+              </w:rPr>
+              <w:t xml:space="preserve">=SUM(E6:E19)</w:t>
             </w:r>
           </w:p>
         </w:tc>

</xml_diff>

<commit_message>
Accrue interest DAILY for every account (was monthly for monthly accounts)
- Interest to Date / Balance Today now use days-elapsed and daily compounding (rate/365) for all accounts
- Monthly-interest accounts no longer sit at a flat monthly figure; they grow every day
- Renamed helper 'Periods Elapsed' -> 'Days Elapsed'; updated subtitles + formula .docx
- Models how banks compute interest on the daily balance
</commit_message>
<xml_diff>
--- a/Digital-Bank-Savings-Tracker-Formulas.docx
+++ b/Digital-Bank-Savings-Tracker-Formulas.docx
@@ -1792,7 +1792,7 @@
     </w:p>
     <w:p>
       <w:r>
-        <w:t xml:space="preserve">One row per account (rows 6-19). Daily accounts (Maya/UNO/Banko/CIMB/Maribank savings) compound daily; the rest compound monthly. Maya Savings rate is set to 10%. Example shows row 6. Columns N-Q make the balance grow automatically over time using the TODAY() function.</w:t>
+        <w:t xml:space="preserve">One row per account (rows 6-19). Interest to Date and Balance Today accrue DAILY for every account (annual rate / 365, compounded each day). Maya Savings rate is set to 10%. Example shows row 6. Columns N-R make the balance grow automatically over time using the TODAY() function.</w:t>
       </w:r>
     </w:p>
     <w:tbl>
@@ -2266,21 +2266,21 @@
                 <w:color w:val="1F3864"/>
                 <w:sz w:val="18"/>
               </w:rPr>
-              <w:t xml:space="preserve">=IF(ISNUMBER(N6),IF(F6="Daily",MAX(0,TODAY()-N6),MAX(0,DATEDIF(N6,TODAY(),"m"))),0)</w:t>
-            </w:r>
-          </w:p>
-        </w:tc>
-        <w:tc>
-          <w:tcPr>
-            <w:tcW w:w="3800" w:type="dxa"/>
-            <w:vAlign w:val="center"/>
-          </w:tcPr>
-          <w:p>
-            <w:r>
-              <w:rPr>
-                <w:sz w:val="18"/>
-              </w:rPr>
-              <w:t xml:space="preserve">Periods Elapsed: days since the start date for daily accounts, or whole months for monthly accounts, up to TODAY(). Because it uses TODAY(), it grows by itself each time you open the file.</w:t>
+              <w:t xml:space="preserve">=IF(ISNUMBER(N6),MAX(0,TODAY()-N6),0)</w:t>
+            </w:r>
+          </w:p>
+        </w:tc>
+        <w:tc>
+          <w:tcPr>
+            <w:tcW w:w="3800" w:type="dxa"/>
+            <w:vAlign w:val="center"/>
+          </w:tcPr>
+          <w:p>
+            <w:r>
+              <w:rPr>
+                <w:sz w:val="18"/>
+              </w:rPr>
+              <w:t xml:space="preserve">Days Elapsed: number of days from the Interest Start date up to TODAY(), for every account. Because it uses TODAY(), it grows by one each day the file is opened.</w:t>
             </w:r>
           </w:p>
         </w:tc>
@@ -2313,21 +2313,21 @@
                 <w:color w:val="1F3864"/>
                 <w:sz w:val="18"/>
               </w:rPr>
-              <w:t xml:space="preserve">=G6*((1+H6)^O6-1)</w:t>
-            </w:r>
-          </w:p>
-        </w:tc>
-        <w:tc>
-          <w:tcPr>
-            <w:tcW w:w="3800" w:type="dxa"/>
-            <w:vAlign w:val="center"/>
-          </w:tcPr>
-          <w:p>
-            <w:r>
-              <w:rPr>
-                <w:sz w:val="18"/>
-              </w:rPr>
-              <w:t xml:space="preserve">Interest to Date: compound interest actually earned from the start date until today.</w:t>
+              <w:t xml:space="preserve">=G6*((1+E6/365)^O6-1)</w:t>
+            </w:r>
+          </w:p>
+        </w:tc>
+        <w:tc>
+          <w:tcPr>
+            <w:tcW w:w="3800" w:type="dxa"/>
+            <w:vAlign w:val="center"/>
+          </w:tcPr>
+          <w:p>
+            <w:r>
+              <w:rPr>
+                <w:sz w:val="18"/>
+              </w:rPr>
+              <w:t xml:space="preserve">Interest to Date: interest earned so far, accrued DAILY for every account (daily rate = annual rate / 365, compounded each day).</w:t>
             </w:r>
           </w:p>
         </w:tc>
@@ -2374,7 +2374,7 @@
               <w:rPr>
                 <w:sz w:val="18"/>
               </w:rPr>
-              <w:t xml:space="preserve">Balance Today: current balance plus interest to date - the amount that increases on its own each day/month.</w:t>
+              <w:t xml:space="preserve">Balance Today: current balance plus interest to date - the amount that increases a little on its own every day.</w:t>
             </w:r>
           </w:p>
         </w:tc>
@@ -2490,7 +2490,7 @@
     </w:p>
     <w:p>
       <w:r>
-        <w:t xml:space="preserve">The Interest sheet uses TODAY(), which Excel refreshes every time the file is opened (or recalculated). So each new day, daily-interest accounts grow a little, and each new month, monthly-interest accounts step up - the Balance Today, the Dashboard totals and the Savings-by-Bank pie all rise on their own without you editing anything. Note: this is an estimate of what your money earns; because interest is now accrued automatically, do NOT also record interest as a manual transaction (that would double-count). Actual bank postings and any taxes may differ slightly.</w:t>
+        <w:t xml:space="preserve">The Interest sheet uses TODAY(), which Excel refreshes every time the file is opened (or recalculated). So each new day, every account's interest grows a little - the Balance Today, the Dashboard totals and the Savings-by-Bank pie all rise on their own without you editing anything. Note: this is an estimate of what your money earns; because interest is accrued automatically, do NOT also record interest as a manual transaction (that would double-count). Actual bank postings and any taxes may differ slightly.</w:t>
       </w:r>
     </w:p>
     <w:p>

</xml_diff>

<commit_message>
Transactions interest ledger now shows interest PER DAY (small daily amounts), not the running total
- Ledger Amount = each account's Interest / Day (Balance x rate/365), e.g. Maya Savings PHP 13.15/day
- Relabeled section 'Interest Earned per Day'; total row = total per day (PHP 81.87)
- Running cumulative total that feeds Current Balance stays on the Balance/Interest tabs
- Ledger is display-only (not summed into balances), so no double-count/loop; updated docx
</commit_message>
<xml_diff>
--- a/Digital-Bank-Savings-Tracker-Formulas.docx
+++ b/Digital-Bank-Savings-Tracker-Formulas.docx
@@ -1054,7 +1054,7 @@
     </w:p>
     <w:p>
       <w:r>
-        <w:t xml:space="preserve">At the TOP of the Transactions tab (rows 4-20) is an auto-posted Interest ledger - one line per account, read-only, generated by formula (not typed). It is kept above the log so the log can grow freely, and it sits in separate rows so filtering/sorting the log never affects it:</w:t>
+        <w:t xml:space="preserve">At the TOP of the Transactions tab (rows 4-20) is an auto-posted Interest ledger - one line per account, read-only, generated by formula (not typed). It shows each account's interest earned PER DAY. It is kept above the log so the log can grow freely, and it sits in separate rows so filtering/sorting the log never affects it. (The running total that is actually added to your balance is on the Balance and Interest tabs.)</w:t>
       </w:r>
     </w:p>
     <w:tbl>
@@ -1246,21 +1246,21 @@
                 <w:color w:val="1F3864"/>
                 <w:sz w:val="18"/>
               </w:rPr>
-              <w:t xml:space="preserve">=IFERROR(VLOOKUP(D6,Interest!$D$6:$Q$19,13,FALSE),0)</w:t>
-            </w:r>
-          </w:p>
-        </w:tc>
-        <w:tc>
-          <w:tcPr>
-            <w:tcW w:w="3800" w:type="dxa"/>
-            <w:vAlign w:val="center"/>
-          </w:tcPr>
-          <w:p>
-            <w:r>
-              <w:rPr>
-                <w:sz w:val="18"/>
-              </w:rPr>
-              <w:t xml:space="preserve">Interest earned to date for the account - the same value folded into the Balance sheet's Current Balance. It reads from the Interest sheet (based only on principal), so it never double-counts or creates a loop.</w:t>
+              <w:t xml:space="preserve">=IFERROR(VLOOKUP(D6,Interest!$D$6:$R$19,6,FALSE),0)</w:t>
+            </w:r>
+          </w:p>
+        </w:tc>
+        <w:tc>
+          <w:tcPr>
+            <w:tcW w:w="3800" w:type="dxa"/>
+            <w:vAlign w:val="center"/>
+          </w:tcPr>
+          <w:p>
+            <w:r>
+              <w:rPr>
+                <w:sz w:val="18"/>
+              </w:rPr>
+              <w:t xml:space="preserve">Interest earned per day for the account (Balance x Annual Rate / 365). Pulled from the Interest tab's Interest / Day column.</w:t>
             </w:r>
           </w:p>
         </w:tc>
@@ -1307,7 +1307,7 @@
               <w:rPr>
                 <w:sz w:val="18"/>
               </w:rPr>
-              <w:t xml:space="preserve">Total interest earned to date across all accounts.</w:t>
+              <w:t xml:space="preserve">Total interest earned per day across all accounts.</w:t>
             </w:r>
           </w:p>
         </w:tc>

</xml_diff>

<commit_message>
Balance sheet: show Interest / Day (per-day) instead of the cumulative interest figure
- Balance 'Interest Earned' column -> 'Interest / Day' (Balance x rate/365), matching the Transactions ledger
- Current Balance (col H) unchanged: still Principal + interest accrued to date (daily)
- Dashboard 'Interest Earned to Date' KPI re-sourced to SUM(Interest!P) since Balance col is now per-day
- Updated formula .docx
</commit_message>
<xml_diff>
--- a/Digital-Bank-Savings-Tracker-Formulas.docx
+++ b/Digital-Bank-Savings-Tracker-Formulas.docx
@@ -266,21 +266,21 @@
                 <w:color w:val="1F3864"/>
                 <w:sz w:val="18"/>
               </w:rPr>
-              <w:t xml:space="preserve">=SUM(Balance!$G$6:$G$19)</w:t>
-            </w:r>
-          </w:p>
-        </w:tc>
-        <w:tc>
-          <w:tcPr>
-            <w:tcW w:w="3800" w:type="dxa"/>
-            <w:vAlign w:val="center"/>
-          </w:tcPr>
-          <w:p>
-            <w:r>
-              <w:rPr>
-                <w:sz w:val="18"/>
-              </w:rPr>
-              <w:t xml:space="preserve">Interest Earned to Date (auto): total interest accrued so far across all accounts; increases each day/month.</w:t>
+              <w:t xml:space="preserve">=SUM(Interest!$P$6:$P$19)</w:t>
+            </w:r>
+          </w:p>
+        </w:tc>
+        <w:tc>
+          <w:tcPr>
+            <w:tcW w:w="3800" w:type="dxa"/>
+            <w:vAlign w:val="center"/>
+          </w:tcPr>
+          <w:p>
+            <w:r>
+              <w:rPr>
+                <w:sz w:val="18"/>
+              </w:rPr>
+              <w:t xml:space="preserve">Interest Earned to Date (auto): total interest accrued so far across all accounts; increases each day. (Sourced from the Interest tab because the Balance tab's Interest column now shows a per-day figure.)</w:t>
             </w:r>
           </w:p>
         </w:tc>
@@ -1568,21 +1568,21 @@
                 <w:color w:val="1F3864"/>
                 <w:sz w:val="18"/>
               </w:rPr>
-              <w:t xml:space="preserve">=IFERROR(VLOOKUP(C6,Interest!$D$6:$Q$19,13,FALSE),0)</w:t>
-            </w:r>
-          </w:p>
-        </w:tc>
-        <w:tc>
-          <w:tcPr>
-            <w:tcW w:w="3800" w:type="dxa"/>
-            <w:vAlign w:val="center"/>
-          </w:tcPr>
-          <w:p>
-            <w:r>
-              <w:rPr>
-                <w:sz w:val="18"/>
-              </w:rPr>
-              <w:t xml:space="preserve">Interest Earned: the auto-accrued interest for this account (from the Interest sheet); grows with the date. Also shown as an auto-posted line on the Transactions tab.</w:t>
+              <w:t xml:space="preserve">=IFERROR(VLOOKUP(C6,Interest!$D$6:$Q$19,6,FALSE),0)</w:t>
+            </w:r>
+          </w:p>
+        </w:tc>
+        <w:tc>
+          <w:tcPr>
+            <w:tcW w:w="3800" w:type="dxa"/>
+            <w:vAlign w:val="center"/>
+          </w:tcPr>
+          <w:p>
+            <w:r>
+              <w:rPr>
+                <w:sz w:val="18"/>
+              </w:rPr>
+              <w:t xml:space="preserve">Interest / Day: each account's interest earned per day (from the Interest tab's Interest / Day column). The cumulative interest that is included in Current Balance is on the Interest tab (Interest to Date).</w:t>
             </w:r>
           </w:p>
         </w:tc>

</xml_diff>